<commit_message>
Corrections mineures après 01. INI_slides.pptx et version remaniée de 02.POO_slides.pptx
</commit_message>
<xml_diff>
--- a/_demos/Demo_POO.docx
+++ b/_demos/Demo_POO.docx
@@ -1,10 +1,10 @@
 
 <file path=word/document.xml><?xml version="1.0" encoding="utf-8"?>
-<w:document xmlns:wpc="http://schemas.microsoft.com/office/word/2010/wordprocessingCanvas" xmlns:mc="http://schemas.openxmlformats.org/markup-compatibility/2006" xmlns:o="urn:schemas-microsoft-com:office:office" xmlns:r="http://schemas.openxmlformats.org/officeDocument/2006/relationships" xmlns:m="http://schemas.openxmlformats.org/officeDocument/2006/math" xmlns:v="urn:schemas-microsoft-com:vml" xmlns:wp14="http://schemas.microsoft.com/office/word/2010/wordprocessingDrawing" xmlns:wp="http://schemas.openxmlformats.org/drawingml/2006/wordprocessingDrawing" xmlns:w10="urn:schemas-microsoft-com:office:word" xmlns:w="http://schemas.openxmlformats.org/wordprocessingml/2006/main" xmlns:w14="http://schemas.microsoft.com/office/word/2010/wordml" xmlns:w15="http://schemas.microsoft.com/office/word/2012/wordml" xmlns:wpg="http://schemas.microsoft.com/office/word/2010/wordprocessingGroup" xmlns:wpi="http://schemas.microsoft.com/office/word/2010/wordprocessingInk" xmlns:wne="http://schemas.microsoft.com/office/word/2006/wordml" xmlns:wps="http://schemas.microsoft.com/office/word/2010/wordprocessingShape" xmlns:cx="http://schemas.microsoft.com/office/drawing/2014/chartex" xmlns:cx1="http://schemas.microsoft.com/office/drawing/2015/9/8/chartex" xmlns:cx2="http://schemas.microsoft.com/office/drawing/2015/10/21/chartex" xmlns:cx3="http://schemas.microsoft.com/office/drawing/2016/5/9/chartex" xmlns:cx4="http://schemas.microsoft.com/office/drawing/2016/5/10/chartex" xmlns:cx5="http://schemas.microsoft.com/office/drawing/2016/5/11/chartex" xmlns:cx6="http://schemas.microsoft.com/office/drawing/2016/5/12/chartex" xmlns:cx7="http://schemas.microsoft.com/office/drawing/2016/5/13/chartex" xmlns:cx8="http://schemas.microsoft.com/office/drawing/2016/5/14/chartex" xmlns:aink="http://schemas.microsoft.com/office/drawing/2016/ink" xmlns:am3d="http://schemas.microsoft.com/office/drawing/2017/model3d" xmlns:w16cex="http://schemas.microsoft.com/office/word/2018/wordml/cex" xmlns:w16cid="http://schemas.microsoft.com/office/word/2016/wordml/cid" xmlns:w16="http://schemas.microsoft.com/office/word/2018/wordml" xmlns:w16sdtdh="http://schemas.microsoft.com/office/word/2020/wordml/sdtdatahash" xmlns:w16se="http://schemas.microsoft.com/office/word/2015/wordml/symex" mc:Ignorable="w14 w15 wp14">
+<w:document xmlns:wpc="http://schemas.microsoft.com/office/word/2010/wordprocessingCanvas" xmlns:cx="http://schemas.microsoft.com/office/drawing/2014/chartex" xmlns:cx1="http://schemas.microsoft.com/office/drawing/2015/9/8/chartex" xmlns:cx2="http://schemas.microsoft.com/office/drawing/2015/10/21/chartex" xmlns:cx3="http://schemas.microsoft.com/office/drawing/2016/5/9/chartex" xmlns:cx4="http://schemas.microsoft.com/office/drawing/2016/5/10/chartex" xmlns:cx5="http://schemas.microsoft.com/office/drawing/2016/5/11/chartex" xmlns:cx6="http://schemas.microsoft.com/office/drawing/2016/5/12/chartex" xmlns:cx7="http://schemas.microsoft.com/office/drawing/2016/5/13/chartex" xmlns:cx8="http://schemas.microsoft.com/office/drawing/2016/5/14/chartex" xmlns:mc="http://schemas.openxmlformats.org/markup-compatibility/2006" xmlns:m="http://schemas.openxmlformats.org/officeDocument/2006/math" xmlns:aink="http://schemas.microsoft.com/office/drawing/2016/ink" xmlns:am3d="http://schemas.microsoft.com/office/drawing/2017/model3d" xmlns:oel="http://schemas.microsoft.com/office/2019/extlst" xmlns:r="http://schemas.openxmlformats.org/officeDocument/2006/relationships" xmlns:wp14="http://schemas.microsoft.com/office/word/2010/wordprocessingDrawing" xmlns:wp="http://schemas.openxmlformats.org/drawingml/2006/wordprocessingDrawing" xmlns:wpg="http://schemas.microsoft.com/office/word/2010/wordprocessingGroup" xmlns:wpi="http://schemas.microsoft.com/office/word/2010/wordprocessingInk" xmlns:wps="http://schemas.microsoft.com/office/word/2010/wordprocessingShape" xmlns:o="urn:schemas-microsoft-com:office:office" xmlns:v="urn:schemas-microsoft-com:vml" xmlns:w10="urn:schemas-microsoft-com:office:word" xmlns:w="http://schemas.openxmlformats.org/wordprocessingml/2006/main" xmlns:w14="http://schemas.microsoft.com/office/word/2010/wordml" xmlns:w15="http://schemas.microsoft.com/office/word/2012/wordml" xmlns:w16cex="http://schemas.microsoft.com/office/word/2018/wordml/cex" xmlns:w16cid="http://schemas.microsoft.com/office/word/2016/wordml/cid" xmlns:w16="http://schemas.microsoft.com/office/word/2018/wordml" xmlns:w16sdtdh="http://schemas.microsoft.com/office/word/2020/wordml/sdtdatahash" xmlns:w16sdtfl="http://schemas.microsoft.com/office/word/2024/wordml/sdtformatlock" xmlns:w16se="http://schemas.microsoft.com/office/word/2015/wordml/symex" xmlns:w16du="http://schemas.microsoft.com/office/word/2023/wordml/word16du" xmlns:wne="http://schemas.microsoft.com/office/word/2006/wordml" mc:Ignorable="w14 w15 w16se w16cid w16 w16cex w16sdtdh w16sdtfl w16du wp14">
   <w:body>
     <w:p>
       <w:pPr>
-        <w:spacing w:after="100" w:before="1000"/>
+        <w:spacing w:before="1000" w:after="100"/>
         <w:jc w:val="center"/>
       </w:pPr>
       <w:r>
@@ -13,7 +13,7 @@
           <w:sz w:val="24"/>
           <w:szCs w:val="24"/>
         </w:rPr>
-        <w:t xml:space="preserve">Démonstration du cours</w:t>
+        <w:t>Démonstration du cours</w:t>
       </w:r>
     </w:p>
     <w:p>
@@ -29,7 +29,7 @@
           <w:sz w:val="52"/>
           <w:szCs w:val="52"/>
         </w:rPr>
-        <w:t xml:space="preserve">POO</w:t>
+        <w:t>POO</w:t>
       </w:r>
     </w:p>
     <w:p>
@@ -45,20 +45,25 @@
           <w:sz w:val="30"/>
           <w:szCs w:val="30"/>
         </w:rPr>
-        <w:t xml:space="preserve">Construire une classe, puis l'encapsuler</w:t>
+        <w:t>Construire une classe, puis l'encapsuler</w:t>
       </w:r>
     </w:p>
     <w:tbl>
       <w:tblPr>
-        <w:tblW w:type="dxa" w:w="9360"/>
+        <w:tblW w:w="9360" w:type="dxa"/>
         <w:tblBorders>
-          <w:top w:val="single" w:color="auto" w:sz="4"/>
-          <w:left w:val="single" w:color="auto" w:sz="4"/>
-          <w:bottom w:val="single" w:color="auto" w:sz="4"/>
-          <w:right w:val="single" w:color="auto" w:sz="4"/>
-          <w:insideH w:val="single" w:color="auto" w:sz="4"/>
-          <w:insideV w:val="single" w:color="auto" w:sz="4"/>
+          <w:top w:val="single" w:sz="4" w:space="0" w:color="auto"/>
+          <w:left w:val="single" w:sz="4" w:space="0" w:color="auto"/>
+          <w:bottom w:val="single" w:sz="4" w:space="0" w:color="auto"/>
+          <w:right w:val="single" w:sz="4" w:space="0" w:color="auto"/>
+          <w:insideH w:val="single" w:sz="4" w:space="0" w:color="auto"/>
+          <w:insideV w:val="single" w:sz="4" w:space="0" w:color="auto"/>
         </w:tblBorders>
+        <w:tblCellMar>
+          <w:left w:w="10" w:type="dxa"/>
+          <w:right w:w="10" w:type="dxa"/>
+        </w:tblCellMar>
+        <w:tblLook w:val="0000" w:firstRow="0" w:lastRow="0" w:firstColumn="0" w:lastColumn="0" w:noHBand="0" w:noVBand="0"/>
       </w:tblPr>
       <w:tblGrid>
         <w:gridCol w:w="2000"/>
@@ -66,158 +71,150 @@
         <w:gridCol w:w="2960"/>
       </w:tblGrid>
       <w:tr>
+        <w:tblPrEx>
+          <w:tblCellMar>
+            <w:top w:w="0" w:type="dxa"/>
+            <w:bottom w:w="0" w:type="dxa"/>
+          </w:tblCellMar>
+        </w:tblPrEx>
         <w:trPr>
           <w:tblHeader/>
         </w:trPr>
         <w:tc>
           <w:tcPr>
-            <w:tcW w:type="dxa" w:w="2000"/>
-            <w:shd w:fill="DEEAF6" w:val="clear"/>
+            <w:tcW w:w="2000" w:type="dxa"/>
+            <w:shd w:val="clear" w:color="auto" w:fill="DEEAF6"/>
             <w:tcMar>
-              <w:top w:type="dxa" w:w="55"/>
-              <w:left w:type="dxa" w:w="100"/>
-              <w:bottom w:type="dxa" w:w="55"/>
-              <w:right w:type="dxa" w:w="100"/>
+              <w:top w:w="55" w:type="dxa"/>
+              <w:left w:w="100" w:type="dxa"/>
+              <w:bottom w:w="55" w:type="dxa"/>
+              <w:right w:w="100" w:type="dxa"/>
             </w:tcMar>
           </w:tcPr>
           <w:p>
-            <w:pPr>
-              <w:spacing w:after="0"/>
-            </w:pPr>
             <w:r>
               <w:rPr>
                 <w:b/>
                 <w:bCs/>
-                <w:sz w:val="20"/>
-                <w:szCs w:val="20"/>
-              </w:rPr>
-              <w:t xml:space="preserve">Durée</w:t>
+              </w:rPr>
+              <w:t>Durée</w:t>
             </w:r>
           </w:p>
         </w:tc>
         <w:tc>
           <w:tcPr>
-            <w:tcW w:type="dxa" w:w="4400"/>
-            <w:shd w:fill="DEEAF6" w:val="clear"/>
+            <w:tcW w:w="4400" w:type="dxa"/>
+            <w:shd w:val="clear" w:color="auto" w:fill="DEEAF6"/>
             <w:tcMar>
-              <w:top w:type="dxa" w:w="55"/>
-              <w:left w:type="dxa" w:w="100"/>
-              <w:bottom w:type="dxa" w:w="55"/>
-              <w:right w:type="dxa" w:w="100"/>
+              <w:top w:w="55" w:type="dxa"/>
+              <w:left w:w="100" w:type="dxa"/>
+              <w:bottom w:w="55" w:type="dxa"/>
+              <w:right w:w="100" w:type="dxa"/>
             </w:tcMar>
           </w:tcPr>
           <w:p>
-            <w:pPr>
-              <w:spacing w:after="0"/>
-            </w:pPr>
             <w:r>
               <w:rPr>
                 <w:b/>
                 <w:bCs/>
-                <w:sz w:val="20"/>
-                <w:szCs w:val="20"/>
-              </w:rPr>
-              <w:t xml:space="preserve">Quand la jouer</w:t>
+              </w:rPr>
+              <w:t>Quand la jouer</w:t>
             </w:r>
           </w:p>
         </w:tc>
         <w:tc>
           <w:tcPr>
-            <w:tcW w:type="dxa" w:w="2960"/>
-            <w:shd w:fill="DEEAF6" w:val="clear"/>
+            <w:tcW w:w="2960" w:type="dxa"/>
+            <w:shd w:val="clear" w:color="auto" w:fill="DEEAF6"/>
             <w:tcMar>
-              <w:top w:type="dxa" w:w="55"/>
-              <w:left w:type="dxa" w:w="100"/>
-              <w:bottom w:type="dxa" w:w="55"/>
-              <w:right w:type="dxa" w:w="100"/>
+              <w:top w:w="55" w:type="dxa"/>
+              <w:left w:w="100" w:type="dxa"/>
+              <w:bottom w:w="55" w:type="dxa"/>
+              <w:right w:w="100" w:type="dxa"/>
             </w:tcMar>
           </w:tcPr>
           <w:p>
-            <w:pPr>
-              <w:spacing w:after="0"/>
-            </w:pPr>
             <w:r>
               <w:rPr>
                 <w:b/>
                 <w:bCs/>
-                <w:sz w:val="20"/>
-                <w:szCs w:val="20"/>
-              </w:rPr>
-              <w:t xml:space="preserve">Code final</w:t>
+              </w:rPr>
+              <w:t>Code final</w:t>
             </w:r>
           </w:p>
         </w:tc>
       </w:tr>
       <w:tr>
+        <w:tblPrEx>
+          <w:tblCellMar>
+            <w:top w:w="0" w:type="dxa"/>
+            <w:bottom w:w="0" w:type="dxa"/>
+          </w:tblCellMar>
+        </w:tblPrEx>
         <w:trPr>
           <w:cantSplit/>
         </w:trPr>
         <w:tc>
           <w:tcPr>
-            <w:tcW w:type="dxa" w:w="2000"/>
+            <w:tcW w:w="2000" w:type="dxa"/>
             <w:tcMar>
-              <w:top w:type="dxa" w:w="55"/>
-              <w:left w:type="dxa" w:w="100"/>
-              <w:bottom w:type="dxa" w:w="55"/>
-              <w:right w:type="dxa" w:w="100"/>
+              <w:top w:w="55" w:type="dxa"/>
+              <w:left w:w="100" w:type="dxa"/>
+              <w:bottom w:w="55" w:type="dxa"/>
+              <w:right w:w="100" w:type="dxa"/>
             </w:tcMar>
           </w:tcPr>
           <w:p>
-            <w:pPr>
-              <w:spacing w:after="0"/>
-            </w:pPr>
-            <w:r>
-              <w:rPr>
-                <w:sz w:val="20"/>
-                <w:szCs w:val="20"/>
-              </w:rPr>
-              <w:t xml:space="preserve">12 à 15 minutes</w:t>
+            <w:r>
+              <w:t>12 à 15 minutes</w:t>
             </w:r>
           </w:p>
         </w:tc>
         <w:tc>
           <w:tcPr>
-            <w:tcW w:type="dxa" w:w="4400"/>
+            <w:tcW w:w="4400" w:type="dxa"/>
             <w:tcMar>
-              <w:top w:type="dxa" w:w="55"/>
-              <w:left w:type="dxa" w:w="100"/>
-              <w:bottom w:type="dxa" w:w="55"/>
-              <w:right w:type="dxa" w:w="100"/>
+              <w:top w:w="55" w:type="dxa"/>
+              <w:left w:w="100" w:type="dxa"/>
+              <w:bottom w:w="55" w:type="dxa"/>
+              <w:right w:w="100" w:type="dxa"/>
             </w:tcMar>
           </w:tcPr>
           <w:p>
-            <w:pPr>
-              <w:spacing w:after="0"/>
-            </w:pPr>
-            <w:r>
-              <w:rPr>
-                <w:sz w:val="20"/>
-                <w:szCs w:val="20"/>
-              </w:rPr>
-              <w:t xml:space="preserve">avant POO.1</w:t>
+            <w:r>
+              <w:t>avant POO.1</w:t>
             </w:r>
           </w:p>
         </w:tc>
         <w:tc>
           <w:tcPr>
-            <w:tcW w:type="dxa" w:w="2960"/>
+            <w:tcW w:w="2960" w:type="dxa"/>
             <w:tcMar>
-              <w:top w:type="dxa" w:w="55"/>
-              <w:left w:type="dxa" w:w="100"/>
-              <w:bottom w:type="dxa" w:w="55"/>
-              <w:right w:type="dxa" w:w="100"/>
+              <w:top w:w="55" w:type="dxa"/>
+              <w:left w:w="100" w:type="dxa"/>
+              <w:bottom w:w="55" w:type="dxa"/>
+              <w:right w:w="100" w:type="dxa"/>
             </w:tcMar>
           </w:tcPr>
           <w:p>
-            <w:pPr>
-              <w:spacing w:after="0"/>
-            </w:pPr>
-            <w:r>
-              <w:rPr>
-                <w:sz w:val="20"/>
-                <w:szCs w:val="20"/>
-              </w:rPr>
-              <w:t xml:space="preserve">demos/…/demo/poo/</w:t>
+            <w:r>
+              <w:t>demos/…/</w:t>
+            </w:r>
+            <w:proofErr w:type="spellStart"/>
+            <w:r>
+              <w:t>demo</w:t>
+            </w:r>
+            <w:proofErr w:type="spellEnd"/>
+            <w:r>
+              <w:t>/</w:t>
+            </w:r>
+            <w:proofErr w:type="spellStart"/>
+            <w:r>
+              <w:t>poo</w:t>
+            </w:r>
+            <w:proofErr w:type="spellEnd"/>
+            <w:r>
+              <w:t>/</w:t>
             </w:r>
           </w:p>
         </w:tc>
@@ -227,13 +224,6 @@
       <w:pPr>
         <w:spacing w:after="120"/>
       </w:pPr>
-      <w:r>
-        <w:rPr>
-          <w:sz w:val="22"/>
-          <w:szCs w:val="22"/>
-        </w:rPr>
-        <w:t xml:space="preserve"/>
-      </w:r>
     </w:p>
     <w:p>
       <w:pPr>
@@ -248,15 +238,15 @@
           <w:sz w:val="22"/>
           <w:szCs w:val="22"/>
         </w:rPr>
-        <w:t xml:space="preserve">Document destiné au professeur — ne pas distribuer</w:t>
+        <w:t>Document destiné au professeur — ne pas distribuer</w:t>
       </w:r>
     </w:p>
     <w:p>
       <w:pPr>
         <w:sectPr>
-          <w:pgSz w:w="11906" w:h="16838" w:orient="portrait"/>
+          <w:pgSz w:w="11906" w:h="16838"/>
           <w:pgMar w:top="1440" w:right="1440" w:bottom="1440" w:left="1440" w:header="708" w:footer="708" w:gutter="0"/>
-          <w:pgNumType/>
+          <w:cols w:space="720"/>
           <w:docGrid w:linePitch="360"/>
         </w:sectPr>
       </w:pPr>
@@ -264,7 +254,7 @@
     <w:p>
       <w:pPr>
         <w:keepNext/>
-        <w:spacing w:after="120" w:before="280"/>
+        <w:spacing w:before="280" w:after="120"/>
       </w:pPr>
       <w:r>
         <w:rPr>
@@ -274,6 +264,7 @@
           <w:sz w:val="26"/>
           <w:szCs w:val="26"/>
         </w:rPr>
+        <w:lastRenderedPageBreak/>
         <w:t xml:space="preserve">Étape 1 · </w:t>
       </w:r>
       <w:r>
@@ -284,13 +275,11 @@
           <w:sz w:val="26"/>
           <w:szCs w:val="26"/>
         </w:rPr>
-        <w:t xml:space="preserve">Partir de rien</w:t>
+        <w:t>Partir de rien</w:t>
       </w:r>
       <w:r>
         <w:rPr>
           <w:color w:val="595959"/>
-          <w:sz w:val="20"/>
-          <w:szCs w:val="20"/>
         </w:rPr>
         <w:t xml:space="preserve">   2 min</w:t>
       </w:r>
@@ -304,59 +293,65 @@
           <w:sz w:val="22"/>
           <w:szCs w:val="22"/>
         </w:rPr>
-        <w:t xml:space="preserve">Créer une classe Livre vide, dans un package vide. Taper le squelette à la main, sans générateur : les étudiants doivent voir qu'une classe n'a rien de magique.</w:t>
+        <w:t>Créer une classe Livre vide, dans un package vide. Taper le squelette à la main, sans générateur : les étudiants doivent voir qu'une classe n'a rien de magique.</w:t>
       </w:r>
     </w:p>
     <w:p>
       <w:pPr>
         <w:keepLines/>
-        <w:shd w:fill="F2F2F2" w:val="clear"/>
-        <w:spacing w:after="160" w:before="100"/>
+        <w:shd w:val="clear" w:color="auto" w:fill="F2F2F2"/>
+        <w:spacing w:before="100" w:after="160"/>
         <w:ind w:left="220"/>
       </w:pPr>
       <w:r>
         <w:rPr>
-          <w:rFonts w:ascii="Consolas" w:cs="Consolas" w:eastAsia="Consolas" w:hAnsi="Consolas"/>
+          <w:rFonts w:ascii="Consolas" w:eastAsia="Consolas" w:hAnsi="Consolas" w:cs="Consolas"/>
           <w:sz w:val="19"/>
           <w:szCs w:val="19"/>
         </w:rPr>
-        <w:t xml:space="preserve">public class Livre { }</w:t>
+        <w:t>public class Livre { }</w:t>
       </w:r>
     </w:p>
     <w:tbl>
       <w:tblPr>
-        <w:tblW w:type="dxa" w:w="9360"/>
+        <w:tblW w:w="9360" w:type="dxa"/>
         <w:tblBorders>
-          <w:top w:val="single" w:color="A6A6A6" w:sz="2"/>
-          <w:left w:val="single" w:color="7B9E4B" w:sz="12"/>
-          <w:bottom w:val="single" w:color="A6A6A6" w:sz="2"/>
-          <w:right w:val="single" w:color="A6A6A6" w:sz="2"/>
-          <w:insideH w:val="none"/>
-          <w:insideV w:val="none"/>
+          <w:top w:val="single" w:sz="2" w:space="0" w:color="A6A6A6"/>
+          <w:left w:val="single" w:sz="12" w:space="0" w:color="7B9E4B"/>
+          <w:bottom w:val="single" w:sz="2" w:space="0" w:color="A6A6A6"/>
+          <w:right w:val="single" w:sz="2" w:space="0" w:color="A6A6A6"/>
         </w:tblBorders>
+        <w:tblCellMar>
+          <w:left w:w="10" w:type="dxa"/>
+          <w:right w:w="10" w:type="dxa"/>
+        </w:tblCellMar>
+        <w:tblLook w:val="0000" w:firstRow="0" w:lastRow="0" w:firstColumn="0" w:lastColumn="0" w:noHBand="0" w:noVBand="0"/>
       </w:tblPr>
       <w:tblGrid>
         <w:gridCol w:w="9360"/>
       </w:tblGrid>
       <w:tr>
+        <w:tblPrEx>
+          <w:tblCellMar>
+            <w:top w:w="0" w:type="dxa"/>
+            <w:bottom w:w="0" w:type="dxa"/>
+          </w:tblCellMar>
+        </w:tblPrEx>
         <w:trPr>
           <w:cantSplit/>
         </w:trPr>
         <w:tc>
           <w:tcPr>
-            <w:tcW w:type="dxa" w:w="9360"/>
-            <w:shd w:fill="F7F9FC" w:val="clear"/>
+            <w:tcW w:w="9360" w:type="dxa"/>
+            <w:shd w:val="clear" w:color="auto" w:fill="F7F9FC"/>
             <w:tcMar>
-              <w:top w:type="dxa" w:w="120"/>
-              <w:left w:type="dxa" w:w="160"/>
-              <w:bottom w:type="dxa" w:w="120"/>
-              <w:right w:type="dxa" w:w="160"/>
+              <w:top w:w="120" w:type="dxa"/>
+              <w:left w:w="160" w:type="dxa"/>
+              <w:bottom w:w="120" w:type="dxa"/>
+              <w:right w:w="160" w:type="dxa"/>
             </w:tcMar>
           </w:tcPr>
           <w:p>
-            <w:pPr>
-              <w:spacing w:after="0"/>
-            </w:pPr>
             <w:r>
               <w:rPr>
                 <w:b/>
@@ -371,7 +366,7 @@
                 <w:sz w:val="22"/>
                 <w:szCs w:val="22"/>
               </w:rPr>
-              <w:t xml:space="preserve">une classe est un moule. Elle ne fait encore rien.</w:t>
+              <w:t>une classe est un moule. Elle ne fait encore rien.</w:t>
             </w:r>
           </w:p>
         </w:tc>
@@ -380,7 +375,7 @@
     <w:p>
       <w:pPr>
         <w:keepNext/>
-        <w:spacing w:after="120" w:before="280"/>
+        <w:spacing w:before="280" w:after="120"/>
       </w:pPr>
       <w:r>
         <w:rPr>
@@ -400,13 +395,11 @@
           <w:sz w:val="26"/>
           <w:szCs w:val="26"/>
         </w:rPr>
-        <w:t xml:space="preserve">Des champs publics, et ce qui se passe</w:t>
+        <w:t>Des champs publics, et ce qui se passe</w:t>
       </w:r>
       <w:r>
         <w:rPr>
           <w:color w:val="595959"/>
-          <w:sz w:val="20"/>
-          <w:szCs w:val="20"/>
         </w:rPr>
         <w:t xml:space="preserve">   3 min</w:t>
       </w:r>
@@ -424,12 +417,12 @@
       </w:r>
       <w:r>
         <w:rPr>
-          <w:rFonts w:ascii="Consolas" w:cs="Consolas" w:eastAsia="Consolas" w:hAnsi="Consolas"/>
+          <w:rFonts w:ascii="Consolas" w:eastAsia="Consolas" w:hAnsi="Consolas" w:cs="Consolas"/>
           <w:color w:val="8B2500"/>
           <w:sz w:val="22"/>
           <w:szCs w:val="22"/>
         </w:rPr>
-        <w:t xml:space="preserve">titre</w:t>
+        <w:t>titre</w:t>
       </w:r>
       <w:r>
         <w:rPr>
@@ -440,12 +433,12 @@
       </w:r>
       <w:r>
         <w:rPr>
-          <w:rFonts w:ascii="Consolas" w:cs="Consolas" w:eastAsia="Consolas" w:hAnsi="Consolas"/>
+          <w:rFonts w:ascii="Consolas" w:eastAsia="Consolas" w:hAnsi="Consolas" w:cs="Consolas"/>
           <w:color w:val="8B2500"/>
           <w:sz w:val="22"/>
           <w:szCs w:val="22"/>
         </w:rPr>
-        <w:t xml:space="preserve">auteur</w:t>
+        <w:t>auteur</w:t>
       </w:r>
       <w:r>
         <w:rPr>
@@ -454,15 +447,17 @@
         </w:rPr>
         <w:t xml:space="preserve">, </w:t>
       </w:r>
-      <w:r>
-        <w:rPr>
-          <w:rFonts w:ascii="Consolas" w:cs="Consolas" w:eastAsia="Consolas" w:hAnsi="Consolas"/>
+      <w:proofErr w:type="spellStart"/>
+      <w:r>
+        <w:rPr>
+          <w:rFonts w:ascii="Consolas" w:eastAsia="Consolas" w:hAnsi="Consolas" w:cs="Consolas"/>
           <w:color w:val="8B2500"/>
           <w:sz w:val="22"/>
           <w:szCs w:val="22"/>
         </w:rPr>
-        <w:t xml:space="preserve">anneeDeParution</w:t>
-      </w:r>
+        <w:t>anneeDeParution</w:t>
+      </w:r>
+      <w:proofErr w:type="spellEnd"/>
       <w:r>
         <w:rPr>
           <w:sz w:val="22"/>
@@ -472,12 +467,12 @@
       </w:r>
       <w:r>
         <w:rPr>
-          <w:rFonts w:ascii="Consolas" w:cs="Consolas" w:eastAsia="Consolas" w:hAnsi="Consolas"/>
+          <w:rFonts w:ascii="Consolas" w:eastAsia="Consolas" w:hAnsi="Consolas" w:cs="Consolas"/>
           <w:color w:val="8B2500"/>
           <w:sz w:val="22"/>
           <w:szCs w:val="22"/>
         </w:rPr>
-        <w:t xml:space="preserve">public</w:t>
+        <w:t>public</w:t>
       </w:r>
       <w:r>
         <w:rPr>
@@ -488,12 +483,12 @@
       </w:r>
       <w:r>
         <w:rPr>
-          <w:rFonts w:ascii="Consolas" w:cs="Consolas" w:eastAsia="Consolas" w:hAnsi="Consolas"/>
+          <w:rFonts w:ascii="Consolas" w:eastAsia="Consolas" w:hAnsi="Consolas" w:cs="Consolas"/>
           <w:color w:val="8B2500"/>
           <w:sz w:val="22"/>
           <w:szCs w:val="22"/>
         </w:rPr>
-        <w:t xml:space="preserve">main</w:t>
+        <w:t>main</w:t>
       </w:r>
       <w:r>
         <w:rPr>
@@ -514,23 +509,33 @@
           <w:sz w:val="22"/>
           <w:szCs w:val="22"/>
         </w:rPr>
-        <w:t xml:space="preserve">Puis, devant eux, écrire :</w:t>
+        <w:t>Puis, devant eux, écrire :</w:t>
       </w:r>
     </w:p>
     <w:p>
       <w:pPr>
         <w:keepLines/>
-        <w:shd w:fill="F2F2F2" w:val="clear"/>
-        <w:spacing w:after="160" w:before="100"/>
+        <w:shd w:val="clear" w:color="auto" w:fill="F2F2F2"/>
+        <w:spacing w:before="100" w:after="160"/>
         <w:ind w:left="220"/>
       </w:pPr>
-      <w:r>
-        <w:rPr>
-          <w:rFonts w:ascii="Consolas" w:cs="Consolas" w:eastAsia="Consolas" w:hAnsi="Consolas"/>
+      <w:proofErr w:type="spellStart"/>
+      <w:r>
+        <w:rPr>
+          <w:rFonts w:ascii="Consolas" w:eastAsia="Consolas" w:hAnsi="Consolas" w:cs="Consolas"/>
           <w:sz w:val="19"/>
           <w:szCs w:val="19"/>
         </w:rPr>
-        <w:t xml:space="preserve">livre.anneeDeParution = -3000;</w:t>
+        <w:t>livre.anneeDeParution</w:t>
+      </w:r>
+      <w:proofErr w:type="spellEnd"/>
+      <w:r>
+        <w:rPr>
+          <w:rFonts w:ascii="Consolas" w:eastAsia="Consolas" w:hAnsi="Consolas" w:cs="Consolas"/>
+          <w:sz w:val="19"/>
+          <w:szCs w:val="19"/>
+        </w:rPr>
+        <w:t xml:space="preserve"> = -3000;</w:t>
       </w:r>
     </w:p>
     <w:p>
@@ -542,43 +547,49 @@
           <w:sz w:val="22"/>
           <w:szCs w:val="22"/>
         </w:rPr>
-        <w:t xml:space="preserve">Lancer : ça marche aussi. Laisser le silence s'installer.</w:t>
+        <w:t>Lancer : ça marche aussi. Laisser le silence s'installer.</w:t>
       </w:r>
     </w:p>
     <w:tbl>
       <w:tblPr>
-        <w:tblW w:type="dxa" w:w="9360"/>
+        <w:tblW w:w="9360" w:type="dxa"/>
         <w:tblBorders>
-          <w:top w:val="single" w:color="A6A6A6" w:sz="2"/>
-          <w:left w:val="single" w:color="7B9E4B" w:sz="12"/>
-          <w:bottom w:val="single" w:color="A6A6A6" w:sz="2"/>
-          <w:right w:val="single" w:color="A6A6A6" w:sz="2"/>
-          <w:insideH w:val="none"/>
-          <w:insideV w:val="none"/>
+          <w:top w:val="single" w:sz="2" w:space="0" w:color="A6A6A6"/>
+          <w:left w:val="single" w:sz="12" w:space="0" w:color="7B9E4B"/>
+          <w:bottom w:val="single" w:sz="2" w:space="0" w:color="A6A6A6"/>
+          <w:right w:val="single" w:sz="2" w:space="0" w:color="A6A6A6"/>
         </w:tblBorders>
+        <w:tblCellMar>
+          <w:left w:w="10" w:type="dxa"/>
+          <w:right w:w="10" w:type="dxa"/>
+        </w:tblCellMar>
+        <w:tblLook w:val="0000" w:firstRow="0" w:lastRow="0" w:firstColumn="0" w:lastColumn="0" w:noHBand="0" w:noVBand="0"/>
       </w:tblPr>
       <w:tblGrid>
         <w:gridCol w:w="9360"/>
       </w:tblGrid>
       <w:tr>
+        <w:tblPrEx>
+          <w:tblCellMar>
+            <w:top w:w="0" w:type="dxa"/>
+            <w:bottom w:w="0" w:type="dxa"/>
+          </w:tblCellMar>
+        </w:tblPrEx>
         <w:trPr>
           <w:cantSplit/>
         </w:trPr>
         <w:tc>
           <w:tcPr>
-            <w:tcW w:type="dxa" w:w="9360"/>
-            <w:shd w:fill="F7F9FC" w:val="clear"/>
+            <w:tcW w:w="9360" w:type="dxa"/>
+            <w:shd w:val="clear" w:color="auto" w:fill="F7F9FC"/>
             <w:tcMar>
-              <w:top w:type="dxa" w:w="120"/>
-              <w:left w:type="dxa" w:w="160"/>
-              <w:bottom w:type="dxa" w:w="120"/>
-              <w:right w:type="dxa" w:w="160"/>
+              <w:top w:w="120" w:type="dxa"/>
+              <w:left w:w="160" w:type="dxa"/>
+              <w:bottom w:w="120" w:type="dxa"/>
+              <w:right w:w="160" w:type="dxa"/>
             </w:tcMar>
           </w:tcPr>
           <w:p>
-            <w:pPr>
-              <w:spacing w:after="0"/>
-            </w:pPr>
             <w:r>
               <w:rPr>
                 <w:b/>
@@ -593,7 +604,7 @@
                 <w:sz w:val="22"/>
                 <w:szCs w:val="22"/>
               </w:rPr>
-              <w:t xml:space="preserve">rien n'a protesté. Le programme est faux et personne ne le sait. Voilà le problème qu'on va résoudre.</w:t>
+              <w:t>rien n'a protesté. Le programme est faux et personne ne le sait. Voilà le problème qu'on va résoudre.</w:t>
             </w:r>
           </w:p>
         </w:tc>
@@ -602,7 +613,7 @@
     <w:p>
       <w:pPr>
         <w:keepNext/>
-        <w:spacing w:after="120" w:before="280"/>
+        <w:spacing w:before="280" w:after="120"/>
       </w:pPr>
       <w:r>
         <w:rPr>
@@ -622,13 +633,11 @@
           <w:sz w:val="26"/>
           <w:szCs w:val="26"/>
         </w:rPr>
-        <w:t xml:space="preserve">Fermer, puis rouvrir</w:t>
+        <w:t>Fermer, puis rouvrir</w:t>
       </w:r>
       <w:r>
         <w:rPr>
           <w:color w:val="595959"/>
-          <w:sz w:val="20"/>
-          <w:szCs w:val="20"/>
         </w:rPr>
         <w:t xml:space="preserve">   4 min</w:t>
       </w:r>
@@ -644,21 +653,23 @@
         </w:rPr>
         <w:t xml:space="preserve">Passer les trois champs en </w:t>
       </w:r>
-      <w:r>
-        <w:rPr>
-          <w:rFonts w:ascii="Consolas" w:cs="Consolas" w:eastAsia="Consolas" w:hAnsi="Consolas"/>
+      <w:proofErr w:type="spellStart"/>
+      <w:r>
+        <w:rPr>
+          <w:rFonts w:ascii="Consolas" w:eastAsia="Consolas" w:hAnsi="Consolas" w:cs="Consolas"/>
           <w:color w:val="8B2500"/>
           <w:sz w:val="22"/>
           <w:szCs w:val="22"/>
         </w:rPr>
-        <w:t xml:space="preserve">private</w:t>
-      </w:r>
-      <w:r>
-        <w:rPr>
-          <w:sz w:val="22"/>
-          <w:szCs w:val="22"/>
-        </w:rPr>
-        <w:t xml:space="preserve">. Lancer : ne compile plus. Lire le message d'erreur à voix haute.</w:t>
+        <w:t>private</w:t>
+      </w:r>
+      <w:proofErr w:type="spellEnd"/>
+      <w:r>
+        <w:rPr>
+          <w:sz w:val="22"/>
+          <w:szCs w:val="22"/>
+        </w:rPr>
+        <w:t>. Lancer : ne compile plus. Lire le message d'erreur à voix haute.</w:t>
       </w:r>
     </w:p>
     <w:p>
@@ -672,15 +683,17 @@
         </w:rPr>
         <w:t xml:space="preserve">Générer les accesseurs avec </w:t>
       </w:r>
-      <w:r>
-        <w:rPr>
-          <w:rFonts w:ascii="Consolas" w:cs="Consolas" w:eastAsia="Consolas" w:hAnsi="Consolas"/>
+      <w:proofErr w:type="spellStart"/>
+      <w:r>
+        <w:rPr>
+          <w:rFonts w:ascii="Consolas" w:eastAsia="Consolas" w:hAnsi="Consolas" w:cs="Consolas"/>
           <w:color w:val="8B2500"/>
           <w:sz w:val="22"/>
           <w:szCs w:val="22"/>
         </w:rPr>
-        <w:t xml:space="preserve">Alt+Inser</w:t>
-      </w:r>
+        <w:t>Alt+Inser</w:t>
+      </w:r>
+      <w:proofErr w:type="spellEnd"/>
       <w:r>
         <w:rPr>
           <w:sz w:val="22"/>
@@ -690,12 +703,12 @@
       </w:r>
       <w:r>
         <w:rPr>
-          <w:rFonts w:ascii="Consolas" w:cs="Consolas" w:eastAsia="Consolas" w:hAnsi="Consolas"/>
+          <w:rFonts w:ascii="Consolas" w:eastAsia="Consolas" w:hAnsi="Consolas" w:cs="Consolas"/>
           <w:color w:val="8B2500"/>
           <w:sz w:val="22"/>
           <w:szCs w:val="22"/>
         </w:rPr>
-        <w:t xml:space="preserve">⌘N</w:t>
+        <w:t>⌘N</w:t>
       </w:r>
       <w:r>
         <w:rPr>
@@ -706,12 +719,12 @@
       </w:r>
       <w:r>
         <w:rPr>
-          <w:rFonts w:ascii="Consolas" w:cs="Consolas" w:eastAsia="Consolas" w:hAnsi="Consolas"/>
+          <w:rFonts w:ascii="Consolas" w:eastAsia="Consolas" w:hAnsi="Consolas" w:cs="Consolas"/>
           <w:color w:val="8B2500"/>
           <w:sz w:val="22"/>
           <w:szCs w:val="22"/>
         </w:rPr>
-        <w:t xml:space="preserve">IDE.12</w:t>
+        <w:t>IDE.12</w:t>
       </w:r>
       <w:r>
         <w:rPr>
@@ -723,38 +736,44 @@
     </w:p>
     <w:tbl>
       <w:tblPr>
-        <w:tblW w:type="dxa" w:w="9360"/>
+        <w:tblW w:w="9360" w:type="dxa"/>
         <w:tblBorders>
-          <w:top w:val="single" w:color="A6A6A6" w:sz="2"/>
-          <w:left w:val="single" w:color="7B9E4B" w:sz="12"/>
-          <w:bottom w:val="single" w:color="A6A6A6" w:sz="2"/>
-          <w:right w:val="single" w:color="A6A6A6" w:sz="2"/>
-          <w:insideH w:val="none"/>
-          <w:insideV w:val="none"/>
+          <w:top w:val="single" w:sz="2" w:space="0" w:color="A6A6A6"/>
+          <w:left w:val="single" w:sz="12" w:space="0" w:color="7B9E4B"/>
+          <w:bottom w:val="single" w:sz="2" w:space="0" w:color="A6A6A6"/>
+          <w:right w:val="single" w:sz="2" w:space="0" w:color="A6A6A6"/>
         </w:tblBorders>
+        <w:tblCellMar>
+          <w:left w:w="10" w:type="dxa"/>
+          <w:right w:w="10" w:type="dxa"/>
+        </w:tblCellMar>
+        <w:tblLook w:val="0000" w:firstRow="0" w:lastRow="0" w:firstColumn="0" w:lastColumn="0" w:noHBand="0" w:noVBand="0"/>
       </w:tblPr>
       <w:tblGrid>
         <w:gridCol w:w="9360"/>
       </w:tblGrid>
       <w:tr>
+        <w:tblPrEx>
+          <w:tblCellMar>
+            <w:top w:w="0" w:type="dxa"/>
+            <w:bottom w:w="0" w:type="dxa"/>
+          </w:tblCellMar>
+        </w:tblPrEx>
         <w:trPr>
           <w:cantSplit/>
         </w:trPr>
         <w:tc>
           <w:tcPr>
-            <w:tcW w:type="dxa" w:w="9360"/>
-            <w:shd w:fill="F7F9FC" w:val="clear"/>
+            <w:tcW w:w="9360" w:type="dxa"/>
+            <w:shd w:val="clear" w:color="auto" w:fill="F7F9FC"/>
             <w:tcMar>
-              <w:top w:type="dxa" w:w="120"/>
-              <w:left w:type="dxa" w:w="160"/>
-              <w:bottom w:type="dxa" w:w="120"/>
-              <w:right w:type="dxa" w:w="160"/>
+              <w:top w:w="120" w:type="dxa"/>
+              <w:left w:w="160" w:type="dxa"/>
+              <w:bottom w:w="120" w:type="dxa"/>
+              <w:right w:w="160" w:type="dxa"/>
             </w:tcMar>
           </w:tcPr>
           <w:p>
-            <w:pPr>
-              <w:spacing w:after="0"/>
-            </w:pPr>
             <w:r>
               <w:rPr>
                 <w:b/>
@@ -769,7 +788,7 @@
                 <w:sz w:val="22"/>
                 <w:szCs w:val="22"/>
               </w:rPr>
-              <w:t xml:space="preserve">on a fait un détour pour revenir au même résultat. À quoi bon ? Réponse à l'étape suivante.</w:t>
+              <w:t>on a fait un détour pour revenir au même résultat. À quoi bon ? Réponse à l'étape suivante.</w:t>
             </w:r>
           </w:p>
         </w:tc>
@@ -778,7 +797,7 @@
     <w:p>
       <w:pPr>
         <w:keepNext/>
-        <w:spacing w:after="120" w:before="280"/>
+        <w:spacing w:before="280" w:after="120"/>
       </w:pPr>
       <w:r>
         <w:rPr>
@@ -798,13 +817,11 @@
           <w:sz w:val="26"/>
           <w:szCs w:val="26"/>
         </w:rPr>
-        <w:t xml:space="preserve">Ce que le détour permet</w:t>
+        <w:t>Ce que le détour permet</w:t>
       </w:r>
       <w:r>
         <w:rPr>
           <w:color w:val="595959"/>
-          <w:sz w:val="20"/>
-          <w:szCs w:val="20"/>
         </w:rPr>
         <w:t xml:space="preserve">   3 min</w:t>
       </w:r>
@@ -820,15 +837,17 @@
         </w:rPr>
         <w:t xml:space="preserve">Dans </w:t>
       </w:r>
-      <w:r>
-        <w:rPr>
-          <w:rFonts w:ascii="Consolas" w:cs="Consolas" w:eastAsia="Consolas" w:hAnsi="Consolas"/>
+      <w:proofErr w:type="spellStart"/>
+      <w:r>
+        <w:rPr>
+          <w:rFonts w:ascii="Consolas" w:eastAsia="Consolas" w:hAnsi="Consolas" w:cs="Consolas"/>
           <w:color w:val="8B2500"/>
           <w:sz w:val="22"/>
           <w:szCs w:val="22"/>
         </w:rPr>
-        <w:t xml:space="preserve">setAnneeDeParution</w:t>
-      </w:r>
+        <w:t>setAnneeDeParution</w:t>
+      </w:r>
+      <w:proofErr w:type="spellEnd"/>
       <w:r>
         <w:rPr>
           <w:sz w:val="22"/>
@@ -838,55 +857,61 @@
       </w:r>
       <w:r>
         <w:rPr>
-          <w:rFonts w:ascii="Consolas" w:cs="Consolas" w:eastAsia="Consolas" w:hAnsi="Consolas"/>
+          <w:rFonts w:ascii="Consolas" w:eastAsia="Consolas" w:hAnsi="Consolas" w:cs="Consolas"/>
           <w:color w:val="8B2500"/>
           <w:sz w:val="22"/>
           <w:szCs w:val="22"/>
         </w:rPr>
-        <w:t xml:space="preserve">-3000</w:t>
-      </w:r>
-      <w:r>
-        <w:rPr>
-          <w:sz w:val="22"/>
-          <w:szCs w:val="22"/>
-        </w:rPr>
-        <w:t xml:space="preserve"> : le programme refuse.</w:t>
+        <w:t>-3000</w:t>
+      </w:r>
+      <w:r>
+        <w:rPr>
+          <w:sz w:val="22"/>
+          <w:szCs w:val="22"/>
+        </w:rPr>
+        <w:t> : le programme refuse.</w:t>
       </w:r>
     </w:p>
     <w:tbl>
       <w:tblPr>
-        <w:tblW w:type="dxa" w:w="9360"/>
+        <w:tblW w:w="9360" w:type="dxa"/>
         <w:tblBorders>
-          <w:top w:val="single" w:color="A6A6A6" w:sz="2"/>
-          <w:left w:val="single" w:color="7B9E4B" w:sz="12"/>
-          <w:bottom w:val="single" w:color="A6A6A6" w:sz="2"/>
-          <w:right w:val="single" w:color="A6A6A6" w:sz="2"/>
-          <w:insideH w:val="none"/>
-          <w:insideV w:val="none"/>
+          <w:top w:val="single" w:sz="2" w:space="0" w:color="A6A6A6"/>
+          <w:left w:val="single" w:sz="12" w:space="0" w:color="7B9E4B"/>
+          <w:bottom w:val="single" w:sz="2" w:space="0" w:color="A6A6A6"/>
+          <w:right w:val="single" w:sz="2" w:space="0" w:color="A6A6A6"/>
         </w:tblBorders>
+        <w:tblCellMar>
+          <w:left w:w="10" w:type="dxa"/>
+          <w:right w:w="10" w:type="dxa"/>
+        </w:tblCellMar>
+        <w:tblLook w:val="0000" w:firstRow="0" w:lastRow="0" w:firstColumn="0" w:lastColumn="0" w:noHBand="0" w:noVBand="0"/>
       </w:tblPr>
       <w:tblGrid>
         <w:gridCol w:w="9360"/>
       </w:tblGrid>
       <w:tr>
+        <w:tblPrEx>
+          <w:tblCellMar>
+            <w:top w:w="0" w:type="dxa"/>
+            <w:bottom w:w="0" w:type="dxa"/>
+          </w:tblCellMar>
+        </w:tblPrEx>
         <w:trPr>
           <w:cantSplit/>
         </w:trPr>
         <w:tc>
           <w:tcPr>
-            <w:tcW w:type="dxa" w:w="9360"/>
-            <w:shd w:fill="F7F9FC" w:val="clear"/>
+            <w:tcW w:w="9360" w:type="dxa"/>
+            <w:shd w:val="clear" w:color="auto" w:fill="F7F9FC"/>
             <w:tcMar>
-              <w:top w:type="dxa" w:w="120"/>
-              <w:left w:type="dxa" w:w="160"/>
-              <w:bottom w:type="dxa" w:w="120"/>
-              <w:right w:type="dxa" w:w="160"/>
+              <w:top w:w="120" w:type="dxa"/>
+              <w:left w:w="160" w:type="dxa"/>
+              <w:bottom w:w="120" w:type="dxa"/>
+              <w:right w:w="160" w:type="dxa"/>
             </w:tcMar>
           </w:tcPr>
           <w:p>
-            <w:pPr>
-              <w:spacing w:after="0"/>
-            </w:pPr>
             <w:r>
               <w:rPr>
                 <w:b/>
@@ -901,7 +926,7 @@
                 <w:sz w:val="22"/>
                 <w:szCs w:val="22"/>
               </w:rPr>
-              <w:t xml:space="preserve">c'est la seule chose qu'un champ public ne permettra jamais. L'accesseur n'est pas une formalité, c'est l'endroit où l'on peut mettre une règle.</w:t>
+              <w:t>c'est la seule chose qu'un champ public ne permettra jamais. L'accesseur n'est pas une formalité, c'est l'endroit où l'on peut mettre une règle.</w:t>
             </w:r>
           </w:p>
         </w:tc>
@@ -910,7 +935,7 @@
     <w:p>
       <w:pPr>
         <w:keepNext/>
-        <w:spacing w:after="120" w:before="280"/>
+        <w:spacing w:before="280" w:after="120"/>
       </w:pPr>
       <w:r>
         <w:rPr>
@@ -930,13 +955,11 @@
           <w:sz w:val="26"/>
           <w:szCs w:val="26"/>
         </w:rPr>
-        <w:t xml:space="preserve">La donnée qui n'existe pas</w:t>
+        <w:t>La donnée qui n'existe pas</w:t>
       </w:r>
       <w:r>
         <w:rPr>
           <w:color w:val="595959"/>
-          <w:sz w:val="20"/>
-          <w:szCs w:val="20"/>
         </w:rPr>
         <w:t xml:space="preserve">   3 min</w:t>
       </w:r>
@@ -952,57 +975,65 @@
         </w:rPr>
         <w:t xml:space="preserve">Demander : « et si je veux l'âge du livre ? » Laisser proposer un champ </w:t>
       </w:r>
-      <w:r>
-        <w:rPr>
-          <w:rFonts w:ascii="Consolas" w:cs="Consolas" w:eastAsia="Consolas" w:hAnsi="Consolas"/>
+      <w:proofErr w:type="spellStart"/>
+      <w:r>
+        <w:rPr>
+          <w:rFonts w:ascii="Consolas" w:eastAsia="Consolas" w:hAnsi="Consolas" w:cs="Consolas"/>
           <w:color w:val="8B2500"/>
           <w:sz w:val="22"/>
           <w:szCs w:val="22"/>
         </w:rPr>
-        <w:t xml:space="preserve">age</w:t>
-      </w:r>
-      <w:r>
-        <w:rPr>
-          <w:sz w:val="22"/>
-          <w:szCs w:val="22"/>
-        </w:rPr>
-        <w:t xml:space="preserve">. L'écrire. Puis demander ce qui se passe l'an prochain. Supprimer le champ, écrire la méthode qui calcule.</w:t>
+        <w:t>age</w:t>
+      </w:r>
+      <w:proofErr w:type="spellEnd"/>
+      <w:r>
+        <w:rPr>
+          <w:sz w:val="22"/>
+          <w:szCs w:val="22"/>
+        </w:rPr>
+        <w:t>. L'écrire. Puis demander ce qui se passe l'an prochain. Supprimer le champ, écrire la méthode qui calcule.</w:t>
       </w:r>
     </w:p>
     <w:tbl>
       <w:tblPr>
-        <w:tblW w:type="dxa" w:w="9360"/>
+        <w:tblW w:w="9360" w:type="dxa"/>
         <w:tblBorders>
-          <w:top w:val="single" w:color="A6A6A6" w:sz="2"/>
-          <w:left w:val="single" w:color="7B9E4B" w:sz="12"/>
-          <w:bottom w:val="single" w:color="A6A6A6" w:sz="2"/>
-          <w:right w:val="single" w:color="A6A6A6" w:sz="2"/>
-          <w:insideH w:val="none"/>
-          <w:insideV w:val="none"/>
+          <w:top w:val="single" w:sz="2" w:space="0" w:color="A6A6A6"/>
+          <w:left w:val="single" w:sz="12" w:space="0" w:color="7B9E4B"/>
+          <w:bottom w:val="single" w:sz="2" w:space="0" w:color="A6A6A6"/>
+          <w:right w:val="single" w:sz="2" w:space="0" w:color="A6A6A6"/>
         </w:tblBorders>
+        <w:tblCellMar>
+          <w:left w:w="10" w:type="dxa"/>
+          <w:right w:w="10" w:type="dxa"/>
+        </w:tblCellMar>
+        <w:tblLook w:val="0000" w:firstRow="0" w:lastRow="0" w:firstColumn="0" w:lastColumn="0" w:noHBand="0" w:noVBand="0"/>
       </w:tblPr>
       <w:tblGrid>
         <w:gridCol w:w="9360"/>
       </w:tblGrid>
       <w:tr>
+        <w:tblPrEx>
+          <w:tblCellMar>
+            <w:top w:w="0" w:type="dxa"/>
+            <w:bottom w:w="0" w:type="dxa"/>
+          </w:tblCellMar>
+        </w:tblPrEx>
         <w:trPr>
           <w:cantSplit/>
         </w:trPr>
         <w:tc>
           <w:tcPr>
-            <w:tcW w:type="dxa" w:w="9360"/>
-            <w:shd w:fill="F7F9FC" w:val="clear"/>
+            <w:tcW w:w="9360" w:type="dxa"/>
+            <w:shd w:val="clear" w:color="auto" w:fill="F7F9FC"/>
             <w:tcMar>
-              <w:top w:type="dxa" w:w="120"/>
-              <w:left w:type="dxa" w:w="160"/>
-              <w:bottom w:type="dxa" w:w="120"/>
-              <w:right w:type="dxa" w:w="160"/>
+              <w:top w:w="120" w:type="dxa"/>
+              <w:left w:w="160" w:type="dxa"/>
+              <w:bottom w:w="120" w:type="dxa"/>
+              <w:right w:w="160" w:type="dxa"/>
             </w:tcMar>
           </w:tcPr>
           <w:p>
-            <w:pPr>
-              <w:spacing w:after="0"/>
-            </w:pPr>
             <w:r>
               <w:rPr>
                 <w:b/>
@@ -1017,7 +1048,7 @@
                 <w:sz w:val="22"/>
                 <w:szCs w:val="22"/>
               </w:rPr>
-              <w:t xml:space="preserve">une donnée qu'on peut calculer n'a pas à être stockée. C'est exactement POO.3, qu'ils feront tout à l'heure.</w:t>
+              <w:t>une donnée qu'on peut calculer n'a pas à être stockée. C'est exactement POO.3, qu'ils feront tout à l'heure.</w:t>
             </w:r>
           </w:p>
         </w:tc>
@@ -1025,9 +1056,9 @@
     </w:tbl>
     <w:p>
       <w:pPr>
-        <w:pStyle w:val="Heading2"/>
+        <w:pStyle w:val="Titre2"/>
         <w:keepNext/>
-        <w:spacing w:after="100" w:before="240"/>
+        <w:spacing w:before="240" w:after="100"/>
       </w:pPr>
       <w:r>
         <w:rPr>
@@ -1037,37 +1068,46 @@
           <w:sz w:val="24"/>
           <w:szCs w:val="24"/>
         </w:rPr>
-        <w:t xml:space="preserve">Ce qu'il faut rater exprès</w:t>
+        <w:t>Ce qu'il faut rater exprès</w:t>
       </w:r>
     </w:p>
     <w:tbl>
       <w:tblPr>
-        <w:tblW w:type="dxa" w:w="9360"/>
+        <w:tblW w:w="9360" w:type="dxa"/>
         <w:tblBorders>
-          <w:top w:val="single" w:color="A6A6A6" w:sz="2"/>
-          <w:left w:val="single" w:color="9C2B2B" w:sz="12"/>
-          <w:bottom w:val="single" w:color="A6A6A6" w:sz="2"/>
-          <w:right w:val="single" w:color="A6A6A6" w:sz="2"/>
-          <w:insideH w:val="none"/>
-          <w:insideV w:val="none"/>
+          <w:top w:val="single" w:sz="2" w:space="0" w:color="A6A6A6"/>
+          <w:left w:val="single" w:sz="12" w:space="0" w:color="9C2B2B"/>
+          <w:bottom w:val="single" w:sz="2" w:space="0" w:color="A6A6A6"/>
+          <w:right w:val="single" w:sz="2" w:space="0" w:color="A6A6A6"/>
         </w:tblBorders>
+        <w:tblCellMar>
+          <w:left w:w="10" w:type="dxa"/>
+          <w:right w:w="10" w:type="dxa"/>
+        </w:tblCellMar>
+        <w:tblLook w:val="0000" w:firstRow="0" w:lastRow="0" w:firstColumn="0" w:lastColumn="0" w:noHBand="0" w:noVBand="0"/>
       </w:tblPr>
       <w:tblGrid>
         <w:gridCol w:w="9360"/>
       </w:tblGrid>
       <w:tr>
+        <w:tblPrEx>
+          <w:tblCellMar>
+            <w:top w:w="0" w:type="dxa"/>
+            <w:bottom w:w="0" w:type="dxa"/>
+          </w:tblCellMar>
+        </w:tblPrEx>
         <w:trPr>
           <w:cantSplit/>
         </w:trPr>
         <w:tc>
           <w:tcPr>
-            <w:tcW w:type="dxa" w:w="9360"/>
-            <w:shd w:fill="F7F9FC" w:val="clear"/>
+            <w:tcW w:w="9360" w:type="dxa"/>
+            <w:shd w:val="clear" w:color="auto" w:fill="F7F9FC"/>
             <w:tcMar>
-              <w:top w:type="dxa" w:w="120"/>
-              <w:left w:type="dxa" w:w="160"/>
-              <w:bottom w:type="dxa" w:w="120"/>
-              <w:right w:type="dxa" w:w="160"/>
+              <w:top w:w="120" w:type="dxa"/>
+              <w:left w:w="160" w:type="dxa"/>
+              <w:bottom w:w="120" w:type="dxa"/>
+              <w:right w:w="160" w:type="dxa"/>
             </w:tcMar>
           </w:tcPr>
           <w:p>
@@ -1081,7 +1121,7 @@
                 <w:sz w:val="22"/>
                 <w:szCs w:val="22"/>
               </w:rPr>
-              <w:t xml:space="preserve">À l'étape 3</w:t>
+              <w:t>À l'étape 3</w:t>
             </w:r>
             <w:r>
               <w:rPr>
@@ -1092,12 +1132,12 @@
             </w:r>
             <w:r>
               <w:rPr>
-                <w:rFonts w:ascii="Consolas" w:cs="Consolas" w:eastAsia="Consolas" w:hAnsi="Consolas"/>
+                <w:rFonts w:ascii="Consolas" w:eastAsia="Consolas" w:hAnsi="Consolas" w:cs="Consolas"/>
                 <w:color w:val="8B2500"/>
                 <w:sz w:val="22"/>
                 <w:szCs w:val="22"/>
               </w:rPr>
-              <w:t xml:space="preserve">nom = nom</w:t>
+              <w:t>nom = nom</w:t>
             </w:r>
             <w:r>
               <w:rPr>
@@ -1106,14 +1146,25 @@
               </w:rPr>
               <w:t xml:space="preserve"> au lieu de </w:t>
             </w:r>
-            <w:r>
-              <w:rPr>
-                <w:rFonts w:ascii="Consolas" w:cs="Consolas" w:eastAsia="Consolas" w:hAnsi="Consolas"/>
+            <w:proofErr w:type="spellStart"/>
+            <w:r>
+              <w:rPr>
+                <w:rFonts w:ascii="Consolas" w:eastAsia="Consolas" w:hAnsi="Consolas" w:cs="Consolas"/>
                 <w:color w:val="8B2500"/>
                 <w:sz w:val="22"/>
                 <w:szCs w:val="22"/>
               </w:rPr>
-              <w:t xml:space="preserve">this.nom = nom</w:t>
+              <w:t>this.nom</w:t>
+            </w:r>
+            <w:proofErr w:type="spellEnd"/>
+            <w:r>
+              <w:rPr>
+                <w:rFonts w:ascii="Consolas" w:eastAsia="Consolas" w:hAnsi="Consolas" w:cs="Consolas"/>
+                <w:color w:val="8B2500"/>
+                <w:sz w:val="22"/>
+                <w:szCs w:val="22"/>
+              </w:rPr>
+              <w:t xml:space="preserve"> = nom</w:t>
             </w:r>
             <w:r>
               <w:rPr>
@@ -1132,19 +1183,48 @@
                 <w:sz w:val="22"/>
                 <w:szCs w:val="22"/>
               </w:rPr>
-              <w:t xml:space="preserve">Le compilateur ne dit rien, l'affectation ne fait rien, et le getter rend null. Laisser chercher trente secondes avant de montrer le this.</w:t>
+              <w:t xml:space="preserve">Le compilateur ne dit rien, l'affectation ne fait rien, et le getter rend </w:t>
+            </w:r>
+            <w:proofErr w:type="spellStart"/>
+            <w:r>
+              <w:rPr>
+                <w:sz w:val="22"/>
+                <w:szCs w:val="22"/>
+              </w:rPr>
+              <w:t>null</w:t>
+            </w:r>
+            <w:proofErr w:type="spellEnd"/>
+            <w:r>
+              <w:rPr>
+                <w:sz w:val="22"/>
+                <w:szCs w:val="22"/>
+              </w:rPr>
+              <w:t xml:space="preserve">. Laisser chercher trente secondes avant de montrer le </w:t>
+            </w:r>
+            <w:proofErr w:type="spellStart"/>
+            <w:r>
+              <w:rPr>
+                <w:sz w:val="22"/>
+                <w:szCs w:val="22"/>
+              </w:rPr>
+              <w:t>this</w:t>
+            </w:r>
+            <w:proofErr w:type="spellEnd"/>
+            <w:r>
+              <w:rPr>
+                <w:sz w:val="22"/>
+                <w:szCs w:val="22"/>
+              </w:rPr>
+              <w:t>.</w:t>
             </w:r>
           </w:p>
           <w:p>
-            <w:pPr>
-              <w:spacing w:after="0"/>
-            </w:pPr>
             <w:r>
               <w:rPr>
                 <w:sz w:val="22"/>
                 <w:szCs w:val="22"/>
               </w:rPr>
-              <w:t xml:space="preserve">C'est la première question de POO.2.</w:t>
+              <w:t>C'est la première question de POO.2.</w:t>
             </w:r>
           </w:p>
         </w:tc>
@@ -1152,9 +1232,9 @@
     </w:tbl>
     <w:p>
       <w:pPr>
-        <w:pStyle w:val="Heading2"/>
+        <w:pStyle w:val="Titre2"/>
         <w:keepNext/>
-        <w:spacing w:after="100" w:before="240"/>
+        <w:spacing w:before="240" w:after="100"/>
       </w:pPr>
       <w:r>
         <w:rPr>
@@ -1164,234 +1244,224 @@
           <w:sz w:val="24"/>
           <w:szCs w:val="24"/>
         </w:rPr>
-        <w:t xml:space="preserve">Renvois</w:t>
+        <w:lastRenderedPageBreak/>
+        <w:t>Renvois</w:t>
       </w:r>
     </w:p>
     <w:tbl>
       <w:tblPr>
-        <w:tblW w:type="dxa" w:w="9360"/>
+        <w:tblW w:w="9360" w:type="dxa"/>
         <w:tblBorders>
-          <w:top w:val="single" w:color="auto" w:sz="4"/>
-          <w:left w:val="single" w:color="auto" w:sz="4"/>
-          <w:bottom w:val="single" w:color="auto" w:sz="4"/>
-          <w:right w:val="single" w:color="auto" w:sz="4"/>
-          <w:insideH w:val="single" w:color="auto" w:sz="4"/>
-          <w:insideV w:val="single" w:color="auto" w:sz="4"/>
+          <w:top w:val="single" w:sz="4" w:space="0" w:color="auto"/>
+          <w:left w:val="single" w:sz="4" w:space="0" w:color="auto"/>
+          <w:bottom w:val="single" w:sz="4" w:space="0" w:color="auto"/>
+          <w:right w:val="single" w:sz="4" w:space="0" w:color="auto"/>
+          <w:insideH w:val="single" w:sz="4" w:space="0" w:color="auto"/>
+          <w:insideV w:val="single" w:sz="4" w:space="0" w:color="auto"/>
         </w:tblBorders>
+        <w:tblCellMar>
+          <w:left w:w="10" w:type="dxa"/>
+          <w:right w:w="10" w:type="dxa"/>
+        </w:tblCellMar>
+        <w:tblLook w:val="0000" w:firstRow="0" w:lastRow="0" w:firstColumn="0" w:lastColumn="0" w:noHBand="0" w:noVBand="0"/>
       </w:tblPr>
       <w:tblGrid>
         <w:gridCol w:w="1600"/>
         <w:gridCol w:w="7760"/>
       </w:tblGrid>
       <w:tr>
+        <w:tblPrEx>
+          <w:tblCellMar>
+            <w:top w:w="0" w:type="dxa"/>
+            <w:bottom w:w="0" w:type="dxa"/>
+          </w:tblCellMar>
+        </w:tblPrEx>
         <w:trPr>
           <w:tblHeader/>
         </w:trPr>
         <w:tc>
           <w:tcPr>
-            <w:tcW w:type="dxa" w:w="1600"/>
-            <w:shd w:fill="DEEAF6" w:val="clear"/>
+            <w:tcW w:w="1600" w:type="dxa"/>
+            <w:shd w:val="clear" w:color="auto" w:fill="DEEAF6"/>
             <w:tcMar>
-              <w:top w:type="dxa" w:w="55"/>
-              <w:left w:type="dxa" w:w="100"/>
-              <w:bottom w:type="dxa" w:w="55"/>
-              <w:right w:type="dxa" w:w="100"/>
+              <w:top w:w="55" w:type="dxa"/>
+              <w:left w:w="100" w:type="dxa"/>
+              <w:bottom w:w="55" w:type="dxa"/>
+              <w:right w:w="100" w:type="dxa"/>
             </w:tcMar>
           </w:tcPr>
           <w:p>
-            <w:pPr>
-              <w:spacing w:after="0"/>
-            </w:pPr>
             <w:r>
               <w:rPr>
                 <w:b/>
                 <w:bCs/>
-                <w:sz w:val="20"/>
-                <w:szCs w:val="20"/>
-              </w:rPr>
-              <w:t xml:space="preserve">Code</w:t>
+              </w:rPr>
+              <w:t>Code</w:t>
             </w:r>
           </w:p>
         </w:tc>
         <w:tc>
           <w:tcPr>
-            <w:tcW w:type="dxa" w:w="7760"/>
-            <w:shd w:fill="DEEAF6" w:val="clear"/>
+            <w:tcW w:w="7760" w:type="dxa"/>
+            <w:shd w:val="clear" w:color="auto" w:fill="DEEAF6"/>
             <w:tcMar>
-              <w:top w:type="dxa" w:w="55"/>
-              <w:left w:type="dxa" w:w="100"/>
-              <w:bottom w:type="dxa" w:w="55"/>
-              <w:right w:type="dxa" w:w="100"/>
+              <w:top w:w="55" w:type="dxa"/>
+              <w:left w:w="100" w:type="dxa"/>
+              <w:bottom w:w="55" w:type="dxa"/>
+              <w:right w:w="100" w:type="dxa"/>
             </w:tcMar>
           </w:tcPr>
           <w:p>
-            <w:pPr>
-              <w:spacing w:after="0"/>
-            </w:pPr>
             <w:r>
               <w:rPr>
                 <w:b/>
                 <w:bCs/>
-                <w:sz w:val="20"/>
-                <w:szCs w:val="20"/>
-              </w:rPr>
-              <w:t xml:space="preserve">Ce qu'il dit</w:t>
+              </w:rPr>
+              <w:t>Ce qu'il dit</w:t>
             </w:r>
           </w:p>
         </w:tc>
       </w:tr>
       <w:tr>
+        <w:tblPrEx>
+          <w:tblCellMar>
+            <w:top w:w="0" w:type="dxa"/>
+            <w:bottom w:w="0" w:type="dxa"/>
+          </w:tblCellMar>
+        </w:tblPrEx>
         <w:trPr>
           <w:cantSplit/>
         </w:trPr>
         <w:tc>
           <w:tcPr>
-            <w:tcW w:type="dxa" w:w="1600"/>
+            <w:tcW w:w="1600" w:type="dxa"/>
             <w:tcMar>
-              <w:top w:type="dxa" w:w="55"/>
-              <w:left w:type="dxa" w:w="100"/>
-              <w:bottom w:type="dxa" w:w="55"/>
-              <w:right w:type="dxa" w:w="100"/>
+              <w:top w:w="55" w:type="dxa"/>
+              <w:left w:w="100" w:type="dxa"/>
+              <w:bottom w:w="55" w:type="dxa"/>
+              <w:right w:w="100" w:type="dxa"/>
             </w:tcMar>
           </w:tcPr>
           <w:p>
-            <w:pPr>
-              <w:spacing w:after="0"/>
-            </w:pPr>
-            <w:r>
-              <w:rPr>
-                <w:rFonts w:ascii="Consolas" w:cs="Consolas" w:eastAsia="Consolas" w:hAnsi="Consolas"/>
+            <w:r>
+              <w:rPr>
+                <w:rFonts w:ascii="Consolas" w:eastAsia="Consolas" w:hAnsi="Consolas" w:cs="Consolas"/>
                 <w:sz w:val="18"/>
                 <w:szCs w:val="18"/>
               </w:rPr>
-              <w:t xml:space="preserve">CC-OBJ.2</w:t>
+              <w:t>CC-OBJ.2</w:t>
             </w:r>
           </w:p>
         </w:tc>
         <w:tc>
           <w:tcPr>
-            <w:tcW w:type="dxa" w:w="7760"/>
+            <w:tcW w:w="7760" w:type="dxa"/>
             <w:tcMar>
-              <w:top w:type="dxa" w:w="55"/>
-              <w:left w:type="dxa" w:w="100"/>
-              <w:bottom w:type="dxa" w:w="55"/>
-              <w:right w:type="dxa" w:w="100"/>
+              <w:top w:w="55" w:type="dxa"/>
+              <w:left w:w="100" w:type="dxa"/>
+              <w:bottom w:w="55" w:type="dxa"/>
+              <w:right w:w="100" w:type="dxa"/>
             </w:tcMar>
           </w:tcPr>
           <w:p>
-            <w:pPr>
-              <w:spacing w:after="0"/>
-            </w:pPr>
-            <w:r>
-              <w:rPr>
-                <w:sz w:val="20"/>
-                <w:szCs w:val="20"/>
-              </w:rPr>
-              <w:t xml:space="preserve">un objet expose des comportements, pas ses données</w:t>
+            <w:r>
+              <w:t>un objet expose des comportements, pas ses données</w:t>
             </w:r>
           </w:p>
         </w:tc>
       </w:tr>
       <w:tr>
+        <w:tblPrEx>
+          <w:tblCellMar>
+            <w:top w:w="0" w:type="dxa"/>
+            <w:bottom w:w="0" w:type="dxa"/>
+          </w:tblCellMar>
+        </w:tblPrEx>
         <w:trPr>
           <w:cantSplit/>
         </w:trPr>
         <w:tc>
           <w:tcPr>
-            <w:tcW w:type="dxa" w:w="1600"/>
+            <w:tcW w:w="1600" w:type="dxa"/>
             <w:tcMar>
-              <w:top w:type="dxa" w:w="55"/>
-              <w:left w:type="dxa" w:w="100"/>
-              <w:bottom w:type="dxa" w:w="55"/>
-              <w:right w:type="dxa" w:w="100"/>
+              <w:top w:w="55" w:type="dxa"/>
+              <w:left w:w="100" w:type="dxa"/>
+              <w:bottom w:w="55" w:type="dxa"/>
+              <w:right w:w="100" w:type="dxa"/>
             </w:tcMar>
           </w:tcPr>
           <w:p>
-            <w:pPr>
-              <w:spacing w:after="0"/>
-            </w:pPr>
-            <w:r>
-              <w:rPr>
-                <w:rFonts w:ascii="Consolas" w:cs="Consolas" w:eastAsia="Consolas" w:hAnsi="Consolas"/>
+            <w:r>
+              <w:rPr>
+                <w:rFonts w:ascii="Consolas" w:eastAsia="Consolas" w:hAnsi="Consolas" w:cs="Consolas"/>
                 <w:sz w:val="18"/>
                 <w:szCs w:val="18"/>
               </w:rPr>
-              <w:t xml:space="preserve">CC-NOM.1</w:t>
+              <w:t>CC-NOM.1</w:t>
             </w:r>
           </w:p>
         </w:tc>
         <w:tc>
           <w:tcPr>
-            <w:tcW w:type="dxa" w:w="7760"/>
+            <w:tcW w:w="7760" w:type="dxa"/>
             <w:tcMar>
-              <w:top w:type="dxa" w:w="55"/>
-              <w:left w:type="dxa" w:w="100"/>
-              <w:bottom w:type="dxa" w:w="55"/>
-              <w:right w:type="dxa" w:w="100"/>
+              <w:top w:w="55" w:type="dxa"/>
+              <w:left w:w="100" w:type="dxa"/>
+              <w:bottom w:w="55" w:type="dxa"/>
+              <w:right w:w="100" w:type="dxa"/>
             </w:tcMar>
           </w:tcPr>
           <w:p>
-            <w:pPr>
-              <w:spacing w:after="0"/>
-            </w:pPr>
-            <w:r>
-              <w:rPr>
-                <w:sz w:val="20"/>
-                <w:szCs w:val="20"/>
-              </w:rPr>
-              <w:t xml:space="preserve">un nom répond à la question qu'on se pose en le lisant</w:t>
+            <w:r>
+              <w:t>un nom répond à la question qu'on se pose en le lisant</w:t>
             </w:r>
           </w:p>
         </w:tc>
       </w:tr>
       <w:tr>
+        <w:tblPrEx>
+          <w:tblCellMar>
+            <w:top w:w="0" w:type="dxa"/>
+            <w:bottom w:w="0" w:type="dxa"/>
+          </w:tblCellMar>
+        </w:tblPrEx>
         <w:trPr>
           <w:cantSplit/>
         </w:trPr>
         <w:tc>
           <w:tcPr>
-            <w:tcW w:type="dxa" w:w="1600"/>
+            <w:tcW w:w="1600" w:type="dxa"/>
             <w:tcMar>
-              <w:top w:type="dxa" w:w="55"/>
-              <w:left w:type="dxa" w:w="100"/>
-              <w:bottom w:type="dxa" w:w="55"/>
-              <w:right w:type="dxa" w:w="100"/>
+              <w:top w:w="55" w:type="dxa"/>
+              <w:left w:w="100" w:type="dxa"/>
+              <w:bottom w:w="55" w:type="dxa"/>
+              <w:right w:w="100" w:type="dxa"/>
             </w:tcMar>
           </w:tcPr>
           <w:p>
-            <w:pPr>
-              <w:spacing w:after="0"/>
-            </w:pPr>
-            <w:r>
-              <w:rPr>
-                <w:rFonts w:ascii="Consolas" w:cs="Consolas" w:eastAsia="Consolas" w:hAnsi="Consolas"/>
+            <w:r>
+              <w:rPr>
+                <w:rFonts w:ascii="Consolas" w:eastAsia="Consolas" w:hAnsi="Consolas" w:cs="Consolas"/>
                 <w:sz w:val="18"/>
                 <w:szCs w:val="18"/>
               </w:rPr>
-              <w:t xml:space="preserve">IDE.12</w:t>
+              <w:t>IDE.12</w:t>
             </w:r>
           </w:p>
         </w:tc>
         <w:tc>
           <w:tcPr>
-            <w:tcW w:type="dxa" w:w="7760"/>
+            <w:tcW w:w="7760" w:type="dxa"/>
             <w:tcMar>
-              <w:top w:type="dxa" w:w="55"/>
-              <w:left w:type="dxa" w:w="100"/>
-              <w:bottom w:type="dxa" w:w="55"/>
-              <w:right w:type="dxa" w:w="100"/>
+              <w:top w:w="55" w:type="dxa"/>
+              <w:left w:w="100" w:type="dxa"/>
+              <w:bottom w:w="55" w:type="dxa"/>
+              <w:right w:w="100" w:type="dxa"/>
             </w:tcMar>
           </w:tcPr>
           <w:p>
-            <w:pPr>
-              <w:spacing w:after="0"/>
-            </w:pPr>
-            <w:r>
-              <w:rPr>
-                <w:sz w:val="20"/>
-                <w:szCs w:val="20"/>
-              </w:rPr>
-              <w:t xml:space="preserve">générer les accesseurs</w:t>
+            <w:r>
+              <w:t>générer les accesseurs</w:t>
             </w:r>
           </w:p>
         </w:tc>
@@ -1399,9 +1469,9 @@
     </w:tbl>
     <w:p>
       <w:pPr>
-        <w:pStyle w:val="Heading2"/>
+        <w:pStyle w:val="Titre2"/>
         <w:keepNext/>
-        <w:spacing w:after="100" w:before="240"/>
+        <w:spacing w:before="240" w:after="100"/>
       </w:pPr>
       <w:r>
         <w:rPr>
@@ -1411,7 +1481,7 @@
           <w:sz w:val="24"/>
           <w:szCs w:val="24"/>
         </w:rPr>
-        <w:t xml:space="preserve">Pour rejouer</w:t>
+        <w:t>Pour rejouer</w:t>
       </w:r>
     </w:p>
     <w:p>
@@ -1427,12 +1497,52 @@
       </w:r>
       <w:r>
         <w:rPr>
-          <w:rFonts w:ascii="Consolas" w:cs="Consolas" w:eastAsia="Consolas" w:hAnsi="Consolas"/>
+          <w:rFonts w:ascii="Consolas" w:eastAsia="Consolas" w:hAnsi="Consolas" w:cs="Consolas"/>
           <w:color w:val="8B2500"/>
           <w:sz w:val="22"/>
           <w:szCs w:val="22"/>
         </w:rPr>
-        <w:t xml:space="preserve">_demos/sources_initiales/poo/</w:t>
+        <w:t>_demos/</w:t>
+      </w:r>
+      <w:proofErr w:type="spellStart"/>
+      <w:r>
+        <w:rPr>
+          <w:rFonts w:ascii="Consolas" w:eastAsia="Consolas" w:hAnsi="Consolas" w:cs="Consolas"/>
+          <w:color w:val="8B2500"/>
+          <w:sz w:val="22"/>
+          <w:szCs w:val="22"/>
+        </w:rPr>
+        <w:t>sources_initiales</w:t>
+      </w:r>
+      <w:proofErr w:type="spellEnd"/>
+      <w:r>
+        <w:rPr>
+          <w:rFonts w:ascii="Consolas" w:eastAsia="Consolas" w:hAnsi="Consolas" w:cs="Consolas"/>
+          <w:color w:val="8B2500"/>
+          <w:sz w:val="22"/>
+          <w:szCs w:val="22"/>
+        </w:rPr>
+        <w:t>/</w:t>
+      </w:r>
+      <w:proofErr w:type="spellStart"/>
+      <w:r>
+        <w:rPr>
+          <w:rFonts w:ascii="Consolas" w:eastAsia="Consolas" w:hAnsi="Consolas" w:cs="Consolas"/>
+          <w:color w:val="8B2500"/>
+          <w:sz w:val="22"/>
+          <w:szCs w:val="22"/>
+        </w:rPr>
+        <w:t>poo</w:t>
+      </w:r>
+      <w:proofErr w:type="spellEnd"/>
+      <w:r>
+        <w:rPr>
+          <w:rFonts w:ascii="Consolas" w:eastAsia="Consolas" w:hAnsi="Consolas" w:cs="Consolas"/>
+          <w:color w:val="8B2500"/>
+          <w:sz w:val="22"/>
+          <w:szCs w:val="22"/>
+        </w:rPr>
+        <w:t>/</w:t>
       </w:r>
       <w:r>
         <w:rPr>
@@ -1441,35 +1551,30 @@
         </w:rPr>
         <w:t xml:space="preserve"> si vous voulez gagner les deux premières minutes.</w:t>
       </w:r>
+      <w:r>
+        <w:rPr>
+          <w:sz w:val="22"/>
+          <w:szCs w:val="22"/>
+        </w:rPr>
+        <w:t> </w:t>
+      </w:r>
     </w:p>
     <w:sectPr>
-      <w:footerReference w:type="default" r:id="rId8"/>
-      <w:pgSz w:w="11906" w:h="16838" w:orient="portrait"/>
+      <w:footerReference w:type="default" r:id="rId7"/>
+      <w:pgSz w:w="11906" w:h="16838"/>
       <w:pgMar w:top="1440" w:right="1440" w:bottom="1440" w:left="1440" w:header="708" w:footer="708" w:gutter="0"/>
       <w:pgNumType w:start="1"/>
+      <w:cols w:space="720"/>
       <w:docGrid w:linePitch="360"/>
     </w:sectPr>
   </w:body>
 </w:document>
 </file>
 
-<file path=word/comments.xml><?xml version="1.0" encoding="utf-8"?>
-<w:comments xmlns:cx="http://schemas.microsoft.com/office/drawing/2014/chartex" xmlns:cx1="http://schemas.microsoft.com/office/drawing/2015/9/8/chartex" xmlns:cx2="http://schemas.microsoft.com/office/drawing/2015/10/21/chartex" xmlns:cx3="http://schemas.microsoft.com/office/drawing/2016/5/9/chartex" xmlns:cx4="http://schemas.microsoft.com/office/drawing/2016/5/10/chartex" xmlns:cx5="http://schemas.microsoft.com/office/drawing/2016/5/11/chartex" xmlns:cx6="http://schemas.microsoft.com/office/drawing/2016/5/12/chartex" xmlns:cx7="http://schemas.microsoft.com/office/drawing/2016/5/13/chartex" xmlns:cx8="http://schemas.microsoft.com/office/drawing/2016/5/14/chartex" xmlns:mc="http://schemas.openxmlformats.org/markup-compatibility/2006" xmlns:aink="http://schemas.microsoft.com/office/drawing/2016/ink" xmlns:am3d="http://schemas.microsoft.com/office/drawing/2017/model3d" xmlns:o="urn:schemas-microsoft-com:office:office" xmlns:r="http://schemas.openxmlformats.org/officeDocument/2006/relationships" xmlns:m="http://schemas.openxmlformats.org/officeDocument/2006/math" xmlns:v="urn:schemas-microsoft-com:vml" xmlns:wp14="http://schemas.microsoft.com/office/word/2010/wordprocessingDrawing" xmlns:wp="http://schemas.openxmlformats.org/drawingml/2006/wordprocessingDrawing" xmlns:w10="urn:schemas-microsoft-com:office:word" xmlns:w="http://schemas.openxmlformats.org/wordprocessingml/2006/main" xmlns:w14="http://schemas.microsoft.com/office/word/2010/wordml" xmlns:w15="http://schemas.microsoft.com/office/word/2012/wordml" xmlns:w16cex="http://schemas.microsoft.com/office/word/2018/wordml/cex" xmlns:w16cid="http://schemas.microsoft.com/office/word/2016/wordml/cid" xmlns:w16="http://schemas.microsoft.com/office/word/2018/wordml" xmlns:w16sdtdh="http://schemas.microsoft.com/office/word/2020/wordml/sdtdatahash" xmlns:w16se="http://schemas.microsoft.com/office/word/2015/wordml/symex" xmlns:wpg="http://schemas.microsoft.com/office/word/2010/wordprocessingGroup" xmlns:wpi="http://schemas.microsoft.com/office/word/2010/wordprocessingInk" xmlns:wne="http://schemas.microsoft.com/office/word/2006/wordml" xmlns:wps="http://schemas.microsoft.com/office/word/2010/wordprocessingShape"/>
-</file>
-
 <file path=word/endnotes.xml><?xml version="1.0" encoding="utf-8"?>
-<w:endnotes xmlns:wpc="http://schemas.microsoft.com/office/word/2010/wordprocessingCanvas" xmlns:mc="http://schemas.openxmlformats.org/markup-compatibility/2006" xmlns:o="urn:schemas-microsoft-com:office:office" xmlns:r="http://schemas.openxmlformats.org/officeDocument/2006/relationships" xmlns:m="http://schemas.openxmlformats.org/officeDocument/2006/math" xmlns:v="urn:schemas-microsoft-com:vml" xmlns:wp14="http://schemas.microsoft.com/office/word/2010/wordprocessingDrawing" xmlns:wp="http://schemas.openxmlformats.org/drawingml/2006/wordprocessingDrawing" xmlns:w10="urn:schemas-microsoft-com:office:word" xmlns:w="http://schemas.openxmlformats.org/wordprocessingml/2006/main" xmlns:w14="http://schemas.microsoft.com/office/word/2010/wordml" xmlns:w15="http://schemas.microsoft.com/office/word/2012/wordml" xmlns:wpg="http://schemas.microsoft.com/office/word/2010/wordprocessingGroup" xmlns:wpi="http://schemas.microsoft.com/office/word/2010/wordprocessingInk" xmlns:wne="http://schemas.microsoft.com/office/word/2006/wordml" xmlns:wps="http://schemas.microsoft.com/office/word/2010/wordprocessingShape" mc:Ignorable="w14 w15 wp14">
+<w:endnotes xmlns:wpc="http://schemas.microsoft.com/office/word/2010/wordprocessingCanvas" xmlns:cx="http://schemas.microsoft.com/office/drawing/2014/chartex" xmlns:cx1="http://schemas.microsoft.com/office/drawing/2015/9/8/chartex" xmlns:cx2="http://schemas.microsoft.com/office/drawing/2015/10/21/chartex" xmlns:cx3="http://schemas.microsoft.com/office/drawing/2016/5/9/chartex" xmlns:cx4="http://schemas.microsoft.com/office/drawing/2016/5/10/chartex" xmlns:cx5="http://schemas.microsoft.com/office/drawing/2016/5/11/chartex" xmlns:cx6="http://schemas.microsoft.com/office/drawing/2016/5/12/chartex" xmlns:cx7="http://schemas.microsoft.com/office/drawing/2016/5/13/chartex" xmlns:cx8="http://schemas.microsoft.com/office/drawing/2016/5/14/chartex" xmlns:mc="http://schemas.openxmlformats.org/markup-compatibility/2006" xmlns:m="http://schemas.openxmlformats.org/officeDocument/2006/math" xmlns:aink="http://schemas.microsoft.com/office/drawing/2016/ink" xmlns:am3d="http://schemas.microsoft.com/office/drawing/2017/model3d" xmlns:oel="http://schemas.microsoft.com/office/2019/extlst" xmlns:r="http://schemas.openxmlformats.org/officeDocument/2006/relationships" xmlns:wp14="http://schemas.microsoft.com/office/word/2010/wordprocessingDrawing" xmlns:wp="http://schemas.openxmlformats.org/drawingml/2006/wordprocessingDrawing" xmlns:wpg="http://schemas.microsoft.com/office/word/2010/wordprocessingGroup" xmlns:wpi="http://schemas.microsoft.com/office/word/2010/wordprocessingInk" xmlns:wps="http://schemas.microsoft.com/office/word/2010/wordprocessingShape" xmlns:o="urn:schemas-microsoft-com:office:office" xmlns:v="urn:schemas-microsoft-com:vml" xmlns:w10="urn:schemas-microsoft-com:office:word" xmlns:w="http://schemas.openxmlformats.org/wordprocessingml/2006/main" xmlns:w14="http://schemas.microsoft.com/office/word/2010/wordml" xmlns:w15="http://schemas.microsoft.com/office/word/2012/wordml" xmlns:w16cex="http://schemas.microsoft.com/office/word/2018/wordml/cex" xmlns:w16cid="http://schemas.microsoft.com/office/word/2016/wordml/cid" xmlns:w16="http://schemas.microsoft.com/office/word/2018/wordml" xmlns:w16sdtdh="http://schemas.microsoft.com/office/word/2020/wordml/sdtdatahash" xmlns:w16sdtfl="http://schemas.microsoft.com/office/word/2024/wordml/sdtformatlock" xmlns:w16se="http://schemas.microsoft.com/office/word/2015/wordml/symex" xmlns:w16du="http://schemas.microsoft.com/office/word/2023/wordml/word16du" xmlns:wne="http://schemas.microsoft.com/office/word/2006/wordml" mc:Ignorable="w14 w15 w16se w16cid w16 w16cex w16sdtdh w16sdtfl w16du wp14">
   <w:endnote w:type="separator" w:id="-1">
     <w:p>
-      <w:pPr>
-        <w:spacing w:after="0" w:line="240" w:lineRule="auto"/>
-      </w:pPr>
-      <w:r>
-        <w:rPr>
-          <w:rStyle w:val="EndnoteReference"/>
-        </w:rPr>
-        <w:endnoteRef/>
-      </w:r>
       <w:r>
         <w:separator/>
       </w:r>
@@ -1477,15 +1582,6 @@
   </w:endnote>
   <w:endnote w:type="continuationSeparator" w:id="0">
     <w:p>
-      <w:pPr>
-        <w:spacing w:after="0" w:line="240" w:lineRule="auto"/>
-      </w:pPr>
-      <w:r>
-        <w:rPr>
-          <w:rStyle w:val="EndnoteReference"/>
-        </w:rPr>
-        <w:endnoteRef/>
-      </w:r>
       <w:r>
         <w:continuationSeparator/>
       </w:r>
@@ -1495,23 +1591,33 @@
 </file>
 
 <file path=word/footer1.xml><?xml version="1.0" encoding="utf-8"?>
-<w:ftr xmlns:w="http://schemas.openxmlformats.org/wordprocessingml/2006/main">
+<w:ftr xmlns:wpc="http://schemas.microsoft.com/office/word/2010/wordprocessingCanvas" xmlns:cx="http://schemas.microsoft.com/office/drawing/2014/chartex" xmlns:cx1="http://schemas.microsoft.com/office/drawing/2015/9/8/chartex" xmlns:cx2="http://schemas.microsoft.com/office/drawing/2015/10/21/chartex" xmlns:cx3="http://schemas.microsoft.com/office/drawing/2016/5/9/chartex" xmlns:cx4="http://schemas.microsoft.com/office/drawing/2016/5/10/chartex" xmlns:cx5="http://schemas.microsoft.com/office/drawing/2016/5/11/chartex" xmlns:cx6="http://schemas.microsoft.com/office/drawing/2016/5/12/chartex" xmlns:cx7="http://schemas.microsoft.com/office/drawing/2016/5/13/chartex" xmlns:cx8="http://schemas.microsoft.com/office/drawing/2016/5/14/chartex" xmlns:mc="http://schemas.openxmlformats.org/markup-compatibility/2006" xmlns:m="http://schemas.openxmlformats.org/officeDocument/2006/math" xmlns:aink="http://schemas.microsoft.com/office/drawing/2016/ink" xmlns:am3d="http://schemas.microsoft.com/office/drawing/2017/model3d" xmlns:oel="http://schemas.microsoft.com/office/2019/extlst" xmlns:r="http://schemas.openxmlformats.org/officeDocument/2006/relationships" xmlns:wp14="http://schemas.microsoft.com/office/word/2010/wordprocessingDrawing" xmlns:wp="http://schemas.openxmlformats.org/drawingml/2006/wordprocessingDrawing" xmlns:wpg="http://schemas.microsoft.com/office/word/2010/wordprocessingGroup" xmlns:wpi="http://schemas.microsoft.com/office/word/2010/wordprocessingInk" xmlns:wps="http://schemas.microsoft.com/office/word/2010/wordprocessingShape" xmlns:o="urn:schemas-microsoft-com:office:office" xmlns:v="urn:schemas-microsoft-com:vml" xmlns:w10="urn:schemas-microsoft-com:office:word" xmlns:w="http://schemas.openxmlformats.org/wordprocessingml/2006/main" xmlns:w14="http://schemas.microsoft.com/office/word/2010/wordml" xmlns:w15="http://schemas.microsoft.com/office/word/2012/wordml" xmlns:w16cex="http://schemas.microsoft.com/office/word/2018/wordml/cex" xmlns:w16cid="http://schemas.microsoft.com/office/word/2016/wordml/cid" xmlns:w16="http://schemas.microsoft.com/office/word/2018/wordml" xmlns:w16sdtdh="http://schemas.microsoft.com/office/word/2020/wordml/sdtdatahash" xmlns:w16sdtfl="http://schemas.microsoft.com/office/word/2024/wordml/sdtformatlock" xmlns:w16se="http://schemas.microsoft.com/office/word/2015/wordml/symex" xmlns:w16du="http://schemas.microsoft.com/office/word/2023/wordml/word16du" xmlns:wne="http://schemas.microsoft.com/office/word/2006/wordml" mc:Ignorable="w14 w15 w16se w16cid w16 w16cex w16sdtdh w16sdtfl w16du wp14">
   <w:p>
     <w:pPr>
       <w:jc w:val="center"/>
       <w:rPr>
+        <w:color w:val="595959"/>
         <w:sz w:val="18"/>
         <w:szCs w:val="18"/>
-        <w:color w:val="595959"/>
       </w:rPr>
     </w:pPr>
+    <w:proofErr w:type="spellStart"/>
     <w:r>
       <w:rPr>
+        <w:color w:val="595959"/>
         <w:sz w:val="18"/>
         <w:szCs w:val="18"/>
+      </w:rPr>
+      <w:t>Demo_POO</w:t>
+    </w:r>
+    <w:proofErr w:type="spellEnd"/>
+    <w:r>
+      <w:rPr>
         <w:color w:val="595959"/>
+        <w:sz w:val="18"/>
+        <w:szCs w:val="18"/>
       </w:rPr>
-      <w:t xml:space="preserve">Demo_POO </w:t>
+      <w:t xml:space="preserve"> </w:t>
     </w:r>
     <w:r>
       <w:fldChar w:fldCharType="begin"/>
@@ -1530,44 +1636,28 @@
     </w:r>
     <w:r>
       <w:rPr>
+        <w:color w:val="595959"/>
         <w:sz w:val="18"/>
         <w:szCs w:val="18"/>
-        <w:color w:val="595959"/>
       </w:rPr>
       <w:t xml:space="preserve"> / </w:t>
     </w:r>
-    <w:r>
-      <w:fldChar w:fldCharType="begin"/>
-    </w:r>
-    <w:r>
-      <w:instrText xml:space="preserve"> SECTIONPAGES </w:instrText>
-    </w:r>
-    <w:r>
-      <w:fldChar w:fldCharType="separate"/>
-    </w:r>
-    <w:r>
-      <w:t>2</w:t>
-    </w:r>
-    <w:r>
-      <w:fldChar w:fldCharType="end"/>
-    </w:r>
+    <w:fldSimple w:instr=" SECTIONPAGES ">
+      <w:r>
+        <w:rPr>
+          <w:noProof/>
+        </w:rPr>
+        <w:t>2</w:t>
+      </w:r>
+    </w:fldSimple>
   </w:p>
 </w:ftr>
 </file>
 
 <file path=word/footnotes.xml><?xml version="1.0" encoding="utf-8"?>
-<w:footnotes xmlns:wpc="http://schemas.microsoft.com/office/word/2010/wordprocessingCanvas" xmlns:mc="http://schemas.openxmlformats.org/markup-compatibility/2006" xmlns:o="urn:schemas-microsoft-com:office:office" xmlns:r="http://schemas.openxmlformats.org/officeDocument/2006/relationships" xmlns:m="http://schemas.openxmlformats.org/officeDocument/2006/math" xmlns:v="urn:schemas-microsoft-com:vml" xmlns:wp14="http://schemas.microsoft.com/office/word/2010/wordprocessingDrawing" xmlns:wp="http://schemas.openxmlformats.org/drawingml/2006/wordprocessingDrawing" xmlns:w10="urn:schemas-microsoft-com:office:word" xmlns:w="http://schemas.openxmlformats.org/wordprocessingml/2006/main" xmlns:w14="http://schemas.microsoft.com/office/word/2010/wordml" xmlns:w15="http://schemas.microsoft.com/office/word/2012/wordml" xmlns:wpg="http://schemas.microsoft.com/office/word/2010/wordprocessingGroup" xmlns:wpi="http://schemas.microsoft.com/office/word/2010/wordprocessingInk" xmlns:wne="http://schemas.microsoft.com/office/word/2006/wordml" xmlns:wps="http://schemas.microsoft.com/office/word/2010/wordprocessingShape" mc:Ignorable="w14 w15 wp14">
+<w:footnotes xmlns:wpc="http://schemas.microsoft.com/office/word/2010/wordprocessingCanvas" xmlns:cx="http://schemas.microsoft.com/office/drawing/2014/chartex" xmlns:cx1="http://schemas.microsoft.com/office/drawing/2015/9/8/chartex" xmlns:cx2="http://schemas.microsoft.com/office/drawing/2015/10/21/chartex" xmlns:cx3="http://schemas.microsoft.com/office/drawing/2016/5/9/chartex" xmlns:cx4="http://schemas.microsoft.com/office/drawing/2016/5/10/chartex" xmlns:cx5="http://schemas.microsoft.com/office/drawing/2016/5/11/chartex" xmlns:cx6="http://schemas.microsoft.com/office/drawing/2016/5/12/chartex" xmlns:cx7="http://schemas.microsoft.com/office/drawing/2016/5/13/chartex" xmlns:cx8="http://schemas.microsoft.com/office/drawing/2016/5/14/chartex" xmlns:mc="http://schemas.openxmlformats.org/markup-compatibility/2006" xmlns:m="http://schemas.openxmlformats.org/officeDocument/2006/math" xmlns:aink="http://schemas.microsoft.com/office/drawing/2016/ink" xmlns:am3d="http://schemas.microsoft.com/office/drawing/2017/model3d" xmlns:oel="http://schemas.microsoft.com/office/2019/extlst" xmlns:r="http://schemas.openxmlformats.org/officeDocument/2006/relationships" xmlns:wp14="http://schemas.microsoft.com/office/word/2010/wordprocessingDrawing" xmlns:wp="http://schemas.openxmlformats.org/drawingml/2006/wordprocessingDrawing" xmlns:wpg="http://schemas.microsoft.com/office/word/2010/wordprocessingGroup" xmlns:wpi="http://schemas.microsoft.com/office/word/2010/wordprocessingInk" xmlns:wps="http://schemas.microsoft.com/office/word/2010/wordprocessingShape" xmlns:o="urn:schemas-microsoft-com:office:office" xmlns:v="urn:schemas-microsoft-com:vml" xmlns:w10="urn:schemas-microsoft-com:office:word" xmlns:w="http://schemas.openxmlformats.org/wordprocessingml/2006/main" xmlns:w14="http://schemas.microsoft.com/office/word/2010/wordml" xmlns:w15="http://schemas.microsoft.com/office/word/2012/wordml" xmlns:w16cex="http://schemas.microsoft.com/office/word/2018/wordml/cex" xmlns:w16cid="http://schemas.microsoft.com/office/word/2016/wordml/cid" xmlns:w16="http://schemas.microsoft.com/office/word/2018/wordml" xmlns:w16sdtdh="http://schemas.microsoft.com/office/word/2020/wordml/sdtdatahash" xmlns:w16sdtfl="http://schemas.microsoft.com/office/word/2024/wordml/sdtformatlock" xmlns:w16se="http://schemas.microsoft.com/office/word/2015/wordml/symex" xmlns:w16du="http://schemas.microsoft.com/office/word/2023/wordml/word16du" xmlns:wne="http://schemas.microsoft.com/office/word/2006/wordml" mc:Ignorable="w14 w15 w16se w16cid w16 w16cex w16sdtdh w16sdtfl w16du wp14">
   <w:footnote w:type="separator" w:id="-1">
     <w:p>
-      <w:pPr>
-        <w:spacing w:after="0" w:line="240" w:lineRule="auto"/>
-      </w:pPr>
-      <w:r>
-        <w:rPr>
-          <w:rStyle w:val="FootnoteReference"/>
-        </w:rPr>
-        <w:footnoteRef/>
-      </w:r>
       <w:r>
         <w:separator/>
       </w:r>
@@ -1575,15 +1665,6 @@
   </w:footnote>
   <w:footnote w:type="continuationSeparator" w:id="0">
     <w:p>
-      <w:pPr>
-        <w:spacing w:after="0" w:line="240" w:lineRule="auto"/>
-      </w:pPr>
-      <w:r>
-        <w:rPr>
-          <w:rStyle w:val="FootnoteReference"/>
-        </w:rPr>
-        <w:footnoteRef/>
-      </w:r>
       <w:r>
         <w:continuationSeparator/>
       </w:r>
@@ -1593,10 +1674,66 @@
 </file>
 
 <file path=word/numbering.xml><?xml version="1.0" encoding="utf-8"?>
-<w:numbering xmlns:wpc="http://schemas.microsoft.com/office/word/2010/wordprocessingCanvas" xmlns:mc="http://schemas.openxmlformats.org/markup-compatibility/2006" xmlns:o="urn:schemas-microsoft-com:office:office" xmlns:r="http://schemas.openxmlformats.org/officeDocument/2006/relationships" xmlns:m="http://schemas.openxmlformats.org/officeDocument/2006/math" xmlns:v="urn:schemas-microsoft-com:vml" xmlns:wp14="http://schemas.microsoft.com/office/word/2010/wordprocessingDrawing" xmlns:wp="http://schemas.openxmlformats.org/drawingml/2006/wordprocessingDrawing" xmlns:w10="urn:schemas-microsoft-com:office:word" xmlns:w="http://schemas.openxmlformats.org/wordprocessingml/2006/main" xmlns:w14="http://schemas.microsoft.com/office/word/2010/wordml" xmlns:w15="http://schemas.microsoft.com/office/word/2012/wordml" xmlns:wpg="http://schemas.microsoft.com/office/word/2010/wordprocessingGroup" xmlns:wpi="http://schemas.microsoft.com/office/word/2010/wordprocessingInk" xmlns:wne="http://schemas.microsoft.com/office/word/2006/wordml" xmlns:wps="http://schemas.microsoft.com/office/word/2010/wordprocessingShape" mc:Ignorable="w14 w15 wp14">
+<w:numbering xmlns:wpc="http://schemas.microsoft.com/office/word/2010/wordprocessingCanvas" xmlns:cx="http://schemas.microsoft.com/office/drawing/2014/chartex" xmlns:cx1="http://schemas.microsoft.com/office/drawing/2015/9/8/chartex" xmlns:cx2="http://schemas.microsoft.com/office/drawing/2015/10/21/chartex" xmlns:cx3="http://schemas.microsoft.com/office/drawing/2016/5/9/chartex" xmlns:cx4="http://schemas.microsoft.com/office/drawing/2016/5/10/chartex" xmlns:cx5="http://schemas.microsoft.com/office/drawing/2016/5/11/chartex" xmlns:cx6="http://schemas.microsoft.com/office/drawing/2016/5/12/chartex" xmlns:cx7="http://schemas.microsoft.com/office/drawing/2016/5/13/chartex" xmlns:cx8="http://schemas.microsoft.com/office/drawing/2016/5/14/chartex" xmlns:mc="http://schemas.openxmlformats.org/markup-compatibility/2006" xmlns:m="http://schemas.openxmlformats.org/officeDocument/2006/math" xmlns:aink="http://schemas.microsoft.com/office/drawing/2016/ink" xmlns:am3d="http://schemas.microsoft.com/office/drawing/2017/model3d" xmlns:oel="http://schemas.microsoft.com/office/2019/extlst" xmlns:r="http://schemas.openxmlformats.org/officeDocument/2006/relationships" xmlns:wp14="http://schemas.microsoft.com/office/word/2010/wordprocessingDrawing" xmlns:wp="http://schemas.openxmlformats.org/drawingml/2006/wordprocessingDrawing" xmlns:wpg="http://schemas.microsoft.com/office/word/2010/wordprocessingGroup" xmlns:wpi="http://schemas.microsoft.com/office/word/2010/wordprocessingInk" xmlns:wps="http://schemas.microsoft.com/office/word/2010/wordprocessingShape" xmlns:o="urn:schemas-microsoft-com:office:office" xmlns:v="urn:schemas-microsoft-com:vml" xmlns:w10="urn:schemas-microsoft-com:office:word" xmlns:w="http://schemas.openxmlformats.org/wordprocessingml/2006/main" xmlns:w14="http://schemas.microsoft.com/office/word/2010/wordml" xmlns:w15="http://schemas.microsoft.com/office/word/2012/wordml" xmlns:w16cex="http://schemas.microsoft.com/office/word/2018/wordml/cex" xmlns:w16cid="http://schemas.microsoft.com/office/word/2016/wordml/cid" xmlns:w16="http://schemas.microsoft.com/office/word/2018/wordml" xmlns:w16sdtdh="http://schemas.microsoft.com/office/word/2020/wordml/sdtdatahash" xmlns:w16sdtfl="http://schemas.microsoft.com/office/word/2024/wordml/sdtformatlock" xmlns:w16se="http://schemas.microsoft.com/office/word/2015/wordml/symex" xmlns:w16du="http://schemas.microsoft.com/office/word/2023/wordml/word16du" xmlns:wne="http://schemas.microsoft.com/office/word/2006/wordml" mc:Ignorable="w14 w15 w16se w16cid w16 w16cex w16sdtdh w16sdtfl w16du wp14">
+  <w:abstractNum w:abstractNumId="0" w15:restartNumberingAfterBreak="0">
+    <w:nsid w:val="51C52857"/>
+    <w:multiLevelType w:val="hybridMultilevel"/>
+    <w:tmpl w:val="8DC8A318"/>
+    <w:lvl w:ilvl="0" w:tplc="78640222">
+      <w:start w:val="1"/>
+      <w:numFmt w:val="bullet"/>
+      <w:lvlText w:val="•"/>
+      <w:lvlJc w:val="left"/>
+      <w:pPr>
+        <w:ind w:left="431" w:hanging="259"/>
+      </w:pPr>
+    </w:lvl>
+    <w:lvl w:ilvl="1" w:tplc="2640E5D4">
+      <w:numFmt w:val="decimal"/>
+      <w:lvlText w:val=""/>
+      <w:lvlJc w:val="left"/>
+    </w:lvl>
+    <w:lvl w:ilvl="2" w:tplc="9E84C778">
+      <w:numFmt w:val="decimal"/>
+      <w:lvlText w:val=""/>
+      <w:lvlJc w:val="left"/>
+    </w:lvl>
+    <w:lvl w:ilvl="3" w:tplc="D7EE8358">
+      <w:numFmt w:val="decimal"/>
+      <w:lvlText w:val=""/>
+      <w:lvlJc w:val="left"/>
+    </w:lvl>
+    <w:lvl w:ilvl="4" w:tplc="70EA1A4A">
+      <w:numFmt w:val="decimal"/>
+      <w:lvlText w:val=""/>
+      <w:lvlJc w:val="left"/>
+    </w:lvl>
+    <w:lvl w:ilvl="5" w:tplc="E654A32C">
+      <w:numFmt w:val="decimal"/>
+      <w:lvlText w:val=""/>
+      <w:lvlJc w:val="left"/>
+    </w:lvl>
+    <w:lvl w:ilvl="6" w:tplc="6E0C49A4">
+      <w:numFmt w:val="decimal"/>
+      <w:lvlText w:val=""/>
+      <w:lvlJc w:val="left"/>
+    </w:lvl>
+    <w:lvl w:ilvl="7" w:tplc="64E40EC0">
+      <w:numFmt w:val="decimal"/>
+      <w:lvlText w:val=""/>
+      <w:lvlJc w:val="left"/>
+    </w:lvl>
+    <w:lvl w:ilvl="8" w:tplc="3EEE8984">
+      <w:numFmt w:val="decimal"/>
+      <w:lvlText w:val=""/>
+      <w:lvlJc w:val="left"/>
+    </w:lvl>
+  </w:abstractNum>
   <w:abstractNum w:abstractNumId="1" w15:restartNumberingAfterBreak="0">
+    <w:nsid w:val="560A0C35"/>
     <w:multiLevelType w:val="hybridMultilevel"/>
-    <w:lvl w:ilvl="0" w15:tentative="1">
+    <w:tmpl w:val="00BC77A6"/>
+    <w:lvl w:ilvl="0" w:tplc="8B3864A0">
       <w:start w:val="1"/>
       <w:numFmt w:val="bullet"/>
       <w:lvlText w:val="●"/>
@@ -1605,7 +1742,7 @@
         <w:ind w:left="720" w:hanging="360"/>
       </w:pPr>
     </w:lvl>
-    <w:lvl w:ilvl="1" w15:tentative="1">
+    <w:lvl w:ilvl="1" w:tplc="D990177E">
       <w:start w:val="1"/>
       <w:numFmt w:val="bullet"/>
       <w:lvlText w:val="○"/>
@@ -1614,7 +1751,7 @@
         <w:ind w:left="1440" w:hanging="360"/>
       </w:pPr>
     </w:lvl>
-    <w:lvl w:ilvl="2" w15:tentative="1">
+    <w:lvl w:ilvl="2" w:tplc="7BAE3136">
       <w:start w:val="1"/>
       <w:numFmt w:val="bullet"/>
       <w:lvlText w:val="■"/>
@@ -1623,7 +1760,7 @@
         <w:ind w:left="2160" w:hanging="360"/>
       </w:pPr>
     </w:lvl>
-    <w:lvl w:ilvl="3" w15:tentative="1">
+    <w:lvl w:ilvl="3" w:tplc="71E015F0">
       <w:start w:val="1"/>
       <w:numFmt w:val="bullet"/>
       <w:lvlText w:val="●"/>
@@ -1632,7 +1769,7 @@
         <w:ind w:left="2880" w:hanging="360"/>
       </w:pPr>
     </w:lvl>
-    <w:lvl w:ilvl="4" w15:tentative="1">
+    <w:lvl w:ilvl="4" w:tplc="02F4B58C">
       <w:start w:val="1"/>
       <w:numFmt w:val="bullet"/>
       <w:lvlText w:val="○"/>
@@ -1641,7 +1778,7 @@
         <w:ind w:left="3600" w:hanging="360"/>
       </w:pPr>
     </w:lvl>
-    <w:lvl w:ilvl="5" w15:tentative="1">
+    <w:lvl w:ilvl="5" w:tplc="3DF2F1BC">
       <w:start w:val="1"/>
       <w:numFmt w:val="bullet"/>
       <w:lvlText w:val="■"/>
@@ -1650,7 +1787,7 @@
         <w:ind w:left="4320" w:hanging="360"/>
       </w:pPr>
     </w:lvl>
-    <w:lvl w:ilvl="6" w15:tentative="1">
+    <w:lvl w:ilvl="6" w:tplc="44468070">
       <w:start w:val="1"/>
       <w:numFmt w:val="bullet"/>
       <w:lvlText w:val="●"/>
@@ -1659,7 +1796,7 @@
         <w:ind w:left="5040" w:hanging="360"/>
       </w:pPr>
     </w:lvl>
-    <w:lvl w:ilvl="7" w15:tentative="1">
+    <w:lvl w:ilvl="7" w:tplc="DBF27F78">
       <w:start w:val="1"/>
       <w:numFmt w:val="bullet"/>
       <w:lvlText w:val="●"/>
@@ -1668,7 +1805,7 @@
         <w:ind w:left="5760" w:hanging="360"/>
       </w:pPr>
     </w:lvl>
-    <w:lvl w:ilvl="8" w15:tentative="1">
+    <w:lvl w:ilvl="8" w:tplc="B8CE3F08">
       <w:start w:val="1"/>
       <w:numFmt w:val="bullet"/>
       <w:lvlText w:val="●"/>
@@ -1678,19 +1815,7 @@
       </w:pPr>
     </w:lvl>
   </w:abstractNum>
-  <w:abstractNum w:abstractNumId="2" w15:restartNumberingAfterBreak="0">
-    <w:multiLevelType w:val="hybridMultilevel"/>
-    <w:lvl w:ilvl="0" w15:tentative="1">
-      <w:start w:val="1"/>
-      <w:numFmt w:val="bullet"/>
-      <w:lvlText w:val="•"/>
-      <w:lvlJc w:val="left"/>
-      <w:pPr>
-        <w:ind w:left="431" w:hanging="259"/>
-      </w:pPr>
-    </w:lvl>
-  </w:abstractNum>
-  <w:num w:numId="1">
+  <w:num w:numId="1" w16cid:durableId="1033000410">
     <w:abstractNumId w:val="1"/>
     <w:lvlOverride w:ilvl="0">
       <w:startOverride w:val="1"/>
@@ -1700,101 +1825,531 @@
 </file>
 
 <file path=word/styles.xml><?xml version="1.0" encoding="utf-8"?>
-<w:styles xmlns:mc="http://schemas.openxmlformats.org/markup-compatibility/2006" xmlns:r="http://schemas.openxmlformats.org/officeDocument/2006/relationships" xmlns:w="http://schemas.openxmlformats.org/wordprocessingml/2006/main" xmlns:w14="http://schemas.microsoft.com/office/word/2010/wordml" xmlns:w15="http://schemas.microsoft.com/office/word/2012/wordml" mc:Ignorable="w14 w15">
+<w:styles xmlns:mc="http://schemas.openxmlformats.org/markup-compatibility/2006" xmlns:r="http://schemas.openxmlformats.org/officeDocument/2006/relationships" xmlns:w="http://schemas.openxmlformats.org/wordprocessingml/2006/main" xmlns:w14="http://schemas.microsoft.com/office/word/2010/wordml" xmlns:w15="http://schemas.microsoft.com/office/word/2012/wordml" xmlns:w16cex="http://schemas.microsoft.com/office/word/2018/wordml/cex" xmlns:w16cid="http://schemas.microsoft.com/office/word/2016/wordml/cid" xmlns:w16="http://schemas.microsoft.com/office/word/2018/wordml" xmlns:w16sdtdh="http://schemas.microsoft.com/office/word/2020/wordml/sdtdatahash" xmlns:w16sdtfl="http://schemas.microsoft.com/office/word/2024/wordml/sdtformatlock" xmlns:w16se="http://schemas.microsoft.com/office/word/2015/wordml/symex" xmlns:w16du="http://schemas.microsoft.com/office/word/2023/wordml/word16du" mc:Ignorable="w14 w15 w16se w16cid w16 w16cex w16sdtdh w16sdtfl w16du">
   <w:docDefaults>
-    <w:rPrDefault/>
+    <w:rPrDefault>
+      <w:rPr>
+        <w:rFonts w:ascii="Times New Roman" w:eastAsia="Times New Roman" w:hAnsi="Times New Roman" w:cs="Times New Roman"/>
+        <w:lang w:val="fr-BE" w:eastAsia="fr-FR" w:bidi="ar-SA"/>
+      </w:rPr>
+    </w:rPrDefault>
     <w:pPrDefault/>
   </w:docDefaults>
-  <w:style w:type="paragraph" w:styleId="Title">
+  <w:latentStyles w:defLockedState="0" w:defUIPriority="99" w:defSemiHidden="0" w:defUnhideWhenUsed="0" w:defQFormat="0" w:count="376">
+    <w:lsdException w:name="Normal" w:uiPriority="0" w:qFormat="1"/>
+    <w:lsdException w:name="heading 1" w:uiPriority="9" w:qFormat="1"/>
+    <w:lsdException w:name="heading 2" w:semiHidden="1" w:uiPriority="9" w:unhideWhenUsed="1" w:qFormat="1"/>
+    <w:lsdException w:name="heading 3" w:semiHidden="1" w:uiPriority="9" w:unhideWhenUsed="1" w:qFormat="1"/>
+    <w:lsdException w:name="heading 4" w:semiHidden="1" w:uiPriority="9" w:unhideWhenUsed="1" w:qFormat="1"/>
+    <w:lsdException w:name="heading 5" w:semiHidden="1" w:uiPriority="9" w:unhideWhenUsed="1" w:qFormat="1"/>
+    <w:lsdException w:name="heading 6" w:semiHidden="1" w:uiPriority="9" w:unhideWhenUsed="1" w:qFormat="1"/>
+    <w:lsdException w:name="heading 7" w:semiHidden="1" w:uiPriority="9" w:unhideWhenUsed="1" w:qFormat="1"/>
+    <w:lsdException w:name="heading 8" w:semiHidden="1" w:uiPriority="9" w:unhideWhenUsed="1" w:qFormat="1"/>
+    <w:lsdException w:name="heading 9" w:semiHidden="1" w:uiPriority="9" w:unhideWhenUsed="1" w:qFormat="1"/>
+    <w:lsdException w:name="index 1" w:semiHidden="1" w:unhideWhenUsed="1"/>
+    <w:lsdException w:name="index 2" w:semiHidden="1" w:unhideWhenUsed="1"/>
+    <w:lsdException w:name="index 3" w:semiHidden="1" w:unhideWhenUsed="1"/>
+    <w:lsdException w:name="index 4" w:semiHidden="1" w:unhideWhenUsed="1"/>
+    <w:lsdException w:name="index 5" w:semiHidden="1" w:unhideWhenUsed="1"/>
+    <w:lsdException w:name="index 6" w:semiHidden="1" w:unhideWhenUsed="1"/>
+    <w:lsdException w:name="index 7" w:semiHidden="1" w:unhideWhenUsed="1"/>
+    <w:lsdException w:name="index 8" w:semiHidden="1" w:unhideWhenUsed="1"/>
+    <w:lsdException w:name="index 9" w:semiHidden="1" w:unhideWhenUsed="1"/>
+    <w:lsdException w:name="toc 1" w:semiHidden="1" w:uiPriority="39" w:unhideWhenUsed="1"/>
+    <w:lsdException w:name="toc 2" w:semiHidden="1" w:uiPriority="39" w:unhideWhenUsed="1"/>
+    <w:lsdException w:name="toc 3" w:semiHidden="1" w:uiPriority="39" w:unhideWhenUsed="1"/>
+    <w:lsdException w:name="toc 4" w:semiHidden="1" w:uiPriority="39" w:unhideWhenUsed="1"/>
+    <w:lsdException w:name="toc 5" w:semiHidden="1" w:uiPriority="39" w:unhideWhenUsed="1"/>
+    <w:lsdException w:name="toc 6" w:semiHidden="1" w:uiPriority="39" w:unhideWhenUsed="1"/>
+    <w:lsdException w:name="toc 7" w:semiHidden="1" w:uiPriority="39" w:unhideWhenUsed="1"/>
+    <w:lsdException w:name="toc 8" w:semiHidden="1" w:uiPriority="39" w:unhideWhenUsed="1"/>
+    <w:lsdException w:name="toc 9" w:semiHidden="1" w:uiPriority="39" w:unhideWhenUsed="1"/>
+    <w:lsdException w:name="Normal Indent" w:semiHidden="1" w:unhideWhenUsed="1"/>
+    <w:lsdException w:name="footnote text" w:semiHidden="1" w:unhideWhenUsed="1"/>
+    <w:lsdException w:name="annotation text" w:semiHidden="1" w:unhideWhenUsed="1"/>
+    <w:lsdException w:name="header" w:semiHidden="1" w:unhideWhenUsed="1"/>
+    <w:lsdException w:name="footer" w:semiHidden="1" w:unhideWhenUsed="1"/>
+    <w:lsdException w:name="index heading" w:semiHidden="1" w:unhideWhenUsed="1"/>
+    <w:lsdException w:name="caption" w:semiHidden="1" w:uiPriority="35" w:unhideWhenUsed="1" w:qFormat="1"/>
+    <w:lsdException w:name="table of figures" w:semiHidden="1" w:unhideWhenUsed="1"/>
+    <w:lsdException w:name="envelope address" w:semiHidden="1" w:unhideWhenUsed="1"/>
+    <w:lsdException w:name="envelope return" w:semiHidden="1" w:unhideWhenUsed="1"/>
+    <w:lsdException w:name="footnote reference" w:semiHidden="1" w:unhideWhenUsed="1"/>
+    <w:lsdException w:name="annotation reference" w:semiHidden="1" w:unhideWhenUsed="1"/>
+    <w:lsdException w:name="line number" w:semiHidden="1" w:unhideWhenUsed="1"/>
+    <w:lsdException w:name="page number" w:semiHidden="1" w:unhideWhenUsed="1"/>
+    <w:lsdException w:name="endnote reference" w:semiHidden="1" w:unhideWhenUsed="1"/>
+    <w:lsdException w:name="endnote text" w:semiHidden="1" w:unhideWhenUsed="1"/>
+    <w:lsdException w:name="table of authorities" w:semiHidden="1" w:unhideWhenUsed="1"/>
+    <w:lsdException w:name="macro" w:semiHidden="1" w:unhideWhenUsed="1"/>
+    <w:lsdException w:name="toa heading" w:semiHidden="1" w:unhideWhenUsed="1"/>
+    <w:lsdException w:name="List" w:semiHidden="1" w:unhideWhenUsed="1"/>
+    <w:lsdException w:name="List Bullet" w:semiHidden="1" w:unhideWhenUsed="1"/>
+    <w:lsdException w:name="List Number" w:semiHidden="1" w:unhideWhenUsed="1"/>
+    <w:lsdException w:name="List 2" w:semiHidden="1" w:unhideWhenUsed="1"/>
+    <w:lsdException w:name="List 3" w:semiHidden="1" w:unhideWhenUsed="1"/>
+    <w:lsdException w:name="List 4" w:semiHidden="1" w:unhideWhenUsed="1"/>
+    <w:lsdException w:name="List 5" w:semiHidden="1" w:unhideWhenUsed="1"/>
+    <w:lsdException w:name="List Bullet 2" w:semiHidden="1" w:unhideWhenUsed="1"/>
+    <w:lsdException w:name="List Bullet 3" w:semiHidden="1" w:unhideWhenUsed="1"/>
+    <w:lsdException w:name="List Bullet 4" w:semiHidden="1" w:unhideWhenUsed="1"/>
+    <w:lsdException w:name="List Bullet 5" w:semiHidden="1" w:unhideWhenUsed="1"/>
+    <w:lsdException w:name="List Number 2" w:semiHidden="1" w:unhideWhenUsed="1"/>
+    <w:lsdException w:name="List Number 3" w:semiHidden="1" w:unhideWhenUsed="1"/>
+    <w:lsdException w:name="List Number 4" w:semiHidden="1" w:unhideWhenUsed="1"/>
+    <w:lsdException w:name="List Number 5" w:semiHidden="1" w:unhideWhenUsed="1"/>
+    <w:lsdException w:name="Title" w:uiPriority="10" w:qFormat="1"/>
+    <w:lsdException w:name="Closing" w:semiHidden="1" w:unhideWhenUsed="1"/>
+    <w:lsdException w:name="Signature" w:semiHidden="1" w:unhideWhenUsed="1"/>
+    <w:lsdException w:name="Default Paragraph Font" w:semiHidden="1" w:uiPriority="1" w:unhideWhenUsed="1"/>
+    <w:lsdException w:name="Body Text" w:semiHidden="1" w:unhideWhenUsed="1"/>
+    <w:lsdException w:name="Body Text Indent" w:semiHidden="1" w:unhideWhenUsed="1"/>
+    <w:lsdException w:name="List Continue" w:semiHidden="1" w:unhideWhenUsed="1"/>
+    <w:lsdException w:name="List Continue 2" w:semiHidden="1" w:unhideWhenUsed="1"/>
+    <w:lsdException w:name="List Continue 3" w:semiHidden="1" w:unhideWhenUsed="1"/>
+    <w:lsdException w:name="List Continue 4" w:semiHidden="1" w:unhideWhenUsed="1"/>
+    <w:lsdException w:name="List Continue 5" w:semiHidden="1" w:unhideWhenUsed="1"/>
+    <w:lsdException w:name="Message Header" w:semiHidden="1" w:unhideWhenUsed="1"/>
+    <w:lsdException w:name="Subtitle" w:uiPriority="11" w:qFormat="1"/>
+    <w:lsdException w:name="Salutation" w:semiHidden="1" w:unhideWhenUsed="1"/>
+    <w:lsdException w:name="Date" w:semiHidden="1" w:unhideWhenUsed="1"/>
+    <w:lsdException w:name="Body Text First Indent" w:semiHidden="1" w:unhideWhenUsed="1"/>
+    <w:lsdException w:name="Body Text First Indent 2" w:semiHidden="1" w:unhideWhenUsed="1"/>
+    <w:lsdException w:name="Note Heading" w:semiHidden="1" w:unhideWhenUsed="1"/>
+    <w:lsdException w:name="Body Text 2" w:semiHidden="1" w:unhideWhenUsed="1"/>
+    <w:lsdException w:name="Body Text 3" w:semiHidden="1" w:unhideWhenUsed="1"/>
+    <w:lsdException w:name="Body Text Indent 2" w:semiHidden="1" w:unhideWhenUsed="1"/>
+    <w:lsdException w:name="Body Text Indent 3" w:semiHidden="1" w:unhideWhenUsed="1"/>
+    <w:lsdException w:name="Block Text" w:semiHidden="1" w:unhideWhenUsed="1"/>
+    <w:lsdException w:name="Hyperlink" w:semiHidden="1" w:unhideWhenUsed="1"/>
+    <w:lsdException w:name="FollowedHyperlink" w:semiHidden="1" w:unhideWhenUsed="1"/>
+    <w:lsdException w:name="Strong" w:uiPriority="22" w:qFormat="1"/>
+    <w:lsdException w:name="Emphasis" w:uiPriority="20" w:qFormat="1"/>
+    <w:lsdException w:name="Document Map" w:semiHidden="1" w:unhideWhenUsed="1"/>
+    <w:lsdException w:name="Plain Text" w:semiHidden="1" w:unhideWhenUsed="1"/>
+    <w:lsdException w:name="E-mail Signature" w:semiHidden="1" w:unhideWhenUsed="1"/>
+    <w:lsdException w:name="HTML Top of Form" w:semiHidden="1" w:unhideWhenUsed="1"/>
+    <w:lsdException w:name="HTML Bottom of Form" w:semiHidden="1" w:unhideWhenUsed="1"/>
+    <w:lsdException w:name="Normal (Web)" w:semiHidden="1" w:unhideWhenUsed="1"/>
+    <w:lsdException w:name="HTML Acronym" w:semiHidden="1" w:unhideWhenUsed="1"/>
+    <w:lsdException w:name="HTML Address" w:semiHidden="1" w:unhideWhenUsed="1"/>
+    <w:lsdException w:name="HTML Cite" w:semiHidden="1" w:unhideWhenUsed="1"/>
+    <w:lsdException w:name="HTML Code" w:semiHidden="1" w:unhideWhenUsed="1"/>
+    <w:lsdException w:name="HTML Definition" w:semiHidden="1" w:unhideWhenUsed="1"/>
+    <w:lsdException w:name="HTML Keyboard" w:semiHidden="1" w:unhideWhenUsed="1"/>
+    <w:lsdException w:name="HTML Preformatted" w:semiHidden="1" w:unhideWhenUsed="1"/>
+    <w:lsdException w:name="HTML Sample" w:semiHidden="1" w:unhideWhenUsed="1"/>
+    <w:lsdException w:name="HTML Typewriter" w:semiHidden="1" w:unhideWhenUsed="1"/>
+    <w:lsdException w:name="HTML Variable" w:semiHidden="1" w:unhideWhenUsed="1"/>
+    <w:lsdException w:name="Normal Table" w:semiHidden="1" w:unhideWhenUsed="1"/>
+    <w:lsdException w:name="annotation subject" w:semiHidden="1" w:unhideWhenUsed="1"/>
+    <w:lsdException w:name="No List" w:semiHidden="1" w:unhideWhenUsed="1"/>
+    <w:lsdException w:name="Outline List 1" w:semiHidden="1" w:unhideWhenUsed="1"/>
+    <w:lsdException w:name="Outline List 2" w:semiHidden="1" w:unhideWhenUsed="1"/>
+    <w:lsdException w:name="Outline List 3" w:semiHidden="1" w:unhideWhenUsed="1"/>
+    <w:lsdException w:name="Table Simple 1" w:semiHidden="1" w:unhideWhenUsed="1"/>
+    <w:lsdException w:name="Table Simple 2" w:semiHidden="1" w:unhideWhenUsed="1"/>
+    <w:lsdException w:name="Table Simple 3" w:semiHidden="1" w:unhideWhenUsed="1"/>
+    <w:lsdException w:name="Table Classic 1" w:semiHidden="1" w:unhideWhenUsed="1"/>
+    <w:lsdException w:name="Table Classic 2" w:semiHidden="1" w:unhideWhenUsed="1"/>
+    <w:lsdException w:name="Table Classic 3" w:semiHidden="1" w:unhideWhenUsed="1"/>
+    <w:lsdException w:name="Table Classic 4" w:semiHidden="1" w:unhideWhenUsed="1"/>
+    <w:lsdException w:name="Table Colorful 1" w:semiHidden="1" w:unhideWhenUsed="1"/>
+    <w:lsdException w:name="Table Colorful 2" w:semiHidden="1" w:unhideWhenUsed="1"/>
+    <w:lsdException w:name="Table Colorful 3" w:semiHidden="1" w:unhideWhenUsed="1"/>
+    <w:lsdException w:name="Table Columns 1" w:semiHidden="1" w:unhideWhenUsed="1"/>
+    <w:lsdException w:name="Table Columns 2" w:semiHidden="1" w:unhideWhenUsed="1"/>
+    <w:lsdException w:name="Table Columns 3" w:semiHidden="1" w:unhideWhenUsed="1"/>
+    <w:lsdException w:name="Table Columns 4" w:semiHidden="1" w:unhideWhenUsed="1"/>
+    <w:lsdException w:name="Table Columns 5" w:semiHidden="1" w:unhideWhenUsed="1"/>
+    <w:lsdException w:name="Table Grid 1" w:semiHidden="1" w:unhideWhenUsed="1"/>
+    <w:lsdException w:name="Table Grid 2" w:semiHidden="1" w:unhideWhenUsed="1"/>
+    <w:lsdException w:name="Table Grid 3" w:semiHidden="1" w:unhideWhenUsed="1"/>
+    <w:lsdException w:name="Table Grid 4" w:semiHidden="1" w:unhideWhenUsed="1"/>
+    <w:lsdException w:name="Table Grid 5" w:semiHidden="1" w:unhideWhenUsed="1"/>
+    <w:lsdException w:name="Table Grid 6" w:semiHidden="1" w:unhideWhenUsed="1"/>
+    <w:lsdException w:name="Table Grid 7" w:semiHidden="1" w:unhideWhenUsed="1"/>
+    <w:lsdException w:name="Table Grid 8" w:semiHidden="1" w:unhideWhenUsed="1"/>
+    <w:lsdException w:name="Table List 1" w:semiHidden="1" w:unhideWhenUsed="1"/>
+    <w:lsdException w:name="Table List 2" w:semiHidden="1" w:unhideWhenUsed="1"/>
+    <w:lsdException w:name="Table List 3" w:semiHidden="1" w:unhideWhenUsed="1"/>
+    <w:lsdException w:name="Table List 4" w:semiHidden="1" w:unhideWhenUsed="1"/>
+    <w:lsdException w:name="Table List 5" w:semiHidden="1" w:unhideWhenUsed="1"/>
+    <w:lsdException w:name="Table List 6" w:semiHidden="1" w:unhideWhenUsed="1"/>
+    <w:lsdException w:name="Table List 7" w:semiHidden="1" w:unhideWhenUsed="1"/>
+    <w:lsdException w:name="Table List 8" w:semiHidden="1" w:unhideWhenUsed="1"/>
+    <w:lsdException w:name="Table 3D effects 1" w:semiHidden="1" w:unhideWhenUsed="1"/>
+    <w:lsdException w:name="Table 3D effects 2" w:semiHidden="1" w:unhideWhenUsed="1"/>
+    <w:lsdException w:name="Table 3D effects 3" w:semiHidden="1" w:unhideWhenUsed="1"/>
+    <w:lsdException w:name="Table Contemporary" w:semiHidden="1" w:unhideWhenUsed="1"/>
+    <w:lsdException w:name="Table Elegant" w:semiHidden="1" w:unhideWhenUsed="1"/>
+    <w:lsdException w:name="Table Professional" w:semiHidden="1" w:unhideWhenUsed="1"/>
+    <w:lsdException w:name="Table Subtle 1" w:semiHidden="1" w:unhideWhenUsed="1"/>
+    <w:lsdException w:name="Table Subtle 2" w:semiHidden="1" w:unhideWhenUsed="1"/>
+    <w:lsdException w:name="Table Web 1" w:semiHidden="1" w:unhideWhenUsed="1"/>
+    <w:lsdException w:name="Table Web 2" w:semiHidden="1" w:unhideWhenUsed="1"/>
+    <w:lsdException w:name="Table Web 3" w:semiHidden="1" w:unhideWhenUsed="1"/>
+    <w:lsdException w:name="Balloon Text" w:semiHidden="1" w:unhideWhenUsed="1"/>
+    <w:lsdException w:name="Table Grid" w:uiPriority="39"/>
+    <w:lsdException w:name="Table Theme" w:semiHidden="1" w:unhideWhenUsed="1"/>
+    <w:lsdException w:name="Placeholder Text" w:semiHidden="1"/>
+    <w:lsdException w:name="No Spacing" w:uiPriority="1" w:qFormat="1"/>
+    <w:lsdException w:name="Light Shading" w:uiPriority="60"/>
+    <w:lsdException w:name="Light List" w:uiPriority="61"/>
+    <w:lsdException w:name="Light Grid" w:uiPriority="62"/>
+    <w:lsdException w:name="Medium Shading 1" w:uiPriority="63"/>
+    <w:lsdException w:name="Medium Shading 2" w:uiPriority="64"/>
+    <w:lsdException w:name="Medium List 1" w:uiPriority="65"/>
+    <w:lsdException w:name="Medium List 2" w:uiPriority="66"/>
+    <w:lsdException w:name="Medium Grid 1" w:uiPriority="67"/>
+    <w:lsdException w:name="Medium Grid 2" w:uiPriority="68"/>
+    <w:lsdException w:name="Medium Grid 3" w:uiPriority="69"/>
+    <w:lsdException w:name="Dark List" w:uiPriority="70"/>
+    <w:lsdException w:name="Colorful Shading" w:uiPriority="71"/>
+    <w:lsdException w:name="Colorful List" w:uiPriority="72"/>
+    <w:lsdException w:name="Colorful Grid" w:uiPriority="73"/>
+    <w:lsdException w:name="Light Shading Accent 1" w:uiPriority="60"/>
+    <w:lsdException w:name="Light List Accent 1" w:uiPriority="61"/>
+    <w:lsdException w:name="Light Grid Accent 1" w:uiPriority="62"/>
+    <w:lsdException w:name="Medium Shading 1 Accent 1" w:uiPriority="63"/>
+    <w:lsdException w:name="Medium Shading 2 Accent 1" w:uiPriority="64"/>
+    <w:lsdException w:name="Medium List 1 Accent 1" w:uiPriority="65"/>
+    <w:lsdException w:name="Revision" w:semiHidden="1"/>
+    <w:lsdException w:name="List Paragraph" w:uiPriority="34" w:qFormat="1"/>
+    <w:lsdException w:name="Quote" w:uiPriority="29" w:qFormat="1"/>
+    <w:lsdException w:name="Intense Quote" w:uiPriority="30" w:qFormat="1"/>
+    <w:lsdException w:name="Medium List 2 Accent 1" w:uiPriority="66"/>
+    <w:lsdException w:name="Medium Grid 1 Accent 1" w:uiPriority="67"/>
+    <w:lsdException w:name="Medium Grid 2 Accent 1" w:uiPriority="68"/>
+    <w:lsdException w:name="Medium Grid 3 Accent 1" w:uiPriority="69"/>
+    <w:lsdException w:name="Dark List Accent 1" w:uiPriority="70"/>
+    <w:lsdException w:name="Colorful Shading Accent 1" w:uiPriority="71"/>
+    <w:lsdException w:name="Colorful List Accent 1" w:uiPriority="72"/>
+    <w:lsdException w:name="Colorful Grid Accent 1" w:uiPriority="73"/>
+    <w:lsdException w:name="Light Shading Accent 2" w:uiPriority="60"/>
+    <w:lsdException w:name="Light List Accent 2" w:uiPriority="61"/>
+    <w:lsdException w:name="Light Grid Accent 2" w:uiPriority="62"/>
+    <w:lsdException w:name="Medium Shading 1 Accent 2" w:uiPriority="63"/>
+    <w:lsdException w:name="Medium Shading 2 Accent 2" w:uiPriority="64"/>
+    <w:lsdException w:name="Medium List 1 Accent 2" w:uiPriority="65"/>
+    <w:lsdException w:name="Medium List 2 Accent 2" w:uiPriority="66"/>
+    <w:lsdException w:name="Medium Grid 1 Accent 2" w:uiPriority="67"/>
+    <w:lsdException w:name="Medium Grid 2 Accent 2" w:uiPriority="68"/>
+    <w:lsdException w:name="Medium Grid 3 Accent 2" w:uiPriority="69"/>
+    <w:lsdException w:name="Dark List Accent 2" w:uiPriority="70"/>
+    <w:lsdException w:name="Colorful Shading Accent 2" w:uiPriority="71"/>
+    <w:lsdException w:name="Colorful List Accent 2" w:uiPriority="72"/>
+    <w:lsdException w:name="Colorful Grid Accent 2" w:uiPriority="73"/>
+    <w:lsdException w:name="Light Shading Accent 3" w:uiPriority="60"/>
+    <w:lsdException w:name="Light List Accent 3" w:uiPriority="61"/>
+    <w:lsdException w:name="Light Grid Accent 3" w:uiPriority="62"/>
+    <w:lsdException w:name="Medium Shading 1 Accent 3" w:uiPriority="63"/>
+    <w:lsdException w:name="Medium Shading 2 Accent 3" w:uiPriority="64"/>
+    <w:lsdException w:name="Medium List 1 Accent 3" w:uiPriority="65"/>
+    <w:lsdException w:name="Medium List 2 Accent 3" w:uiPriority="66"/>
+    <w:lsdException w:name="Medium Grid 1 Accent 3" w:uiPriority="67"/>
+    <w:lsdException w:name="Medium Grid 2 Accent 3" w:uiPriority="68"/>
+    <w:lsdException w:name="Medium Grid 3 Accent 3" w:uiPriority="69"/>
+    <w:lsdException w:name="Dark List Accent 3" w:uiPriority="70"/>
+    <w:lsdException w:name="Colorful Shading Accent 3" w:uiPriority="71"/>
+    <w:lsdException w:name="Colorful List Accent 3" w:uiPriority="72"/>
+    <w:lsdException w:name="Colorful Grid Accent 3" w:uiPriority="73"/>
+    <w:lsdException w:name="Light Shading Accent 4" w:uiPriority="60"/>
+    <w:lsdException w:name="Light List Accent 4" w:uiPriority="61"/>
+    <w:lsdException w:name="Light Grid Accent 4" w:uiPriority="62"/>
+    <w:lsdException w:name="Medium Shading 1 Accent 4" w:uiPriority="63"/>
+    <w:lsdException w:name="Medium Shading 2 Accent 4" w:uiPriority="64"/>
+    <w:lsdException w:name="Medium List 1 Accent 4" w:uiPriority="65"/>
+    <w:lsdException w:name="Medium List 2 Accent 4" w:uiPriority="66"/>
+    <w:lsdException w:name="Medium Grid 1 Accent 4" w:uiPriority="67"/>
+    <w:lsdException w:name="Medium Grid 2 Accent 4" w:uiPriority="68"/>
+    <w:lsdException w:name="Medium Grid 3 Accent 4" w:uiPriority="69"/>
+    <w:lsdException w:name="Dark List Accent 4" w:uiPriority="70"/>
+    <w:lsdException w:name="Colorful Shading Accent 4" w:uiPriority="71"/>
+    <w:lsdException w:name="Colorful List Accent 4" w:uiPriority="72"/>
+    <w:lsdException w:name="Colorful Grid Accent 4" w:uiPriority="73"/>
+    <w:lsdException w:name="Light Shading Accent 5" w:uiPriority="60"/>
+    <w:lsdException w:name="Light List Accent 5" w:uiPriority="61"/>
+    <w:lsdException w:name="Light Grid Accent 5" w:uiPriority="62"/>
+    <w:lsdException w:name="Medium Shading 1 Accent 5" w:uiPriority="63"/>
+    <w:lsdException w:name="Medium Shading 2 Accent 5" w:uiPriority="64"/>
+    <w:lsdException w:name="Medium List 1 Accent 5" w:uiPriority="65"/>
+    <w:lsdException w:name="Medium List 2 Accent 5" w:uiPriority="66"/>
+    <w:lsdException w:name="Medium Grid 1 Accent 5" w:uiPriority="67"/>
+    <w:lsdException w:name="Medium Grid 2 Accent 5" w:uiPriority="68"/>
+    <w:lsdException w:name="Medium Grid 3 Accent 5" w:uiPriority="69"/>
+    <w:lsdException w:name="Dark List Accent 5" w:uiPriority="70"/>
+    <w:lsdException w:name="Colorful Shading Accent 5" w:uiPriority="71"/>
+    <w:lsdException w:name="Colorful List Accent 5" w:uiPriority="72"/>
+    <w:lsdException w:name="Colorful Grid Accent 5" w:uiPriority="73"/>
+    <w:lsdException w:name="Light Shading Accent 6" w:uiPriority="60"/>
+    <w:lsdException w:name="Light List Accent 6" w:uiPriority="61"/>
+    <w:lsdException w:name="Light Grid Accent 6" w:uiPriority="62"/>
+    <w:lsdException w:name="Medium Shading 1 Accent 6" w:uiPriority="63"/>
+    <w:lsdException w:name="Medium Shading 2 Accent 6" w:uiPriority="64"/>
+    <w:lsdException w:name="Medium List 1 Accent 6" w:uiPriority="65"/>
+    <w:lsdException w:name="Medium List 2 Accent 6" w:uiPriority="66"/>
+    <w:lsdException w:name="Medium Grid 1 Accent 6" w:uiPriority="67"/>
+    <w:lsdException w:name="Medium Grid 2 Accent 6" w:uiPriority="68"/>
+    <w:lsdException w:name="Medium Grid 3 Accent 6" w:uiPriority="69"/>
+    <w:lsdException w:name="Dark List Accent 6" w:uiPriority="70"/>
+    <w:lsdException w:name="Colorful Shading Accent 6" w:uiPriority="71"/>
+    <w:lsdException w:name="Colorful List Accent 6" w:uiPriority="72"/>
+    <w:lsdException w:name="Colorful Grid Accent 6" w:uiPriority="73"/>
+    <w:lsdException w:name="Subtle Emphasis" w:uiPriority="19" w:qFormat="1"/>
+    <w:lsdException w:name="Intense Emphasis" w:uiPriority="21" w:qFormat="1"/>
+    <w:lsdException w:name="Subtle Reference" w:uiPriority="31" w:qFormat="1"/>
+    <w:lsdException w:name="Intense Reference" w:uiPriority="32" w:qFormat="1"/>
+    <w:lsdException w:name="Book Title" w:uiPriority="33" w:qFormat="1"/>
+    <w:lsdException w:name="Bibliography" w:semiHidden="1" w:uiPriority="37" w:unhideWhenUsed="1"/>
+    <w:lsdException w:name="TOC Heading" w:semiHidden="1" w:uiPriority="39" w:unhideWhenUsed="1" w:qFormat="1"/>
+    <w:lsdException w:name="Plain Table 1" w:uiPriority="41"/>
+    <w:lsdException w:name="Plain Table 2" w:uiPriority="42"/>
+    <w:lsdException w:name="Plain Table 3" w:uiPriority="43"/>
+    <w:lsdException w:name="Plain Table 4" w:uiPriority="44"/>
+    <w:lsdException w:name="Plain Table 5" w:uiPriority="45"/>
+    <w:lsdException w:name="Grid Table Light" w:uiPriority="40"/>
+    <w:lsdException w:name="Grid Table 1 Light" w:uiPriority="46"/>
+    <w:lsdException w:name="Grid Table 2" w:uiPriority="47"/>
+    <w:lsdException w:name="Grid Table 3" w:uiPriority="48"/>
+    <w:lsdException w:name="Grid Table 4" w:uiPriority="49"/>
+    <w:lsdException w:name="Grid Table 5 Dark" w:uiPriority="50"/>
+    <w:lsdException w:name="Grid Table 6 Colorful" w:uiPriority="51"/>
+    <w:lsdException w:name="Grid Table 7 Colorful" w:uiPriority="52"/>
+    <w:lsdException w:name="Grid Table 1 Light Accent 1" w:uiPriority="46"/>
+    <w:lsdException w:name="Grid Table 2 Accent 1" w:uiPriority="47"/>
+    <w:lsdException w:name="Grid Table 3 Accent 1" w:uiPriority="48"/>
+    <w:lsdException w:name="Grid Table 4 Accent 1" w:uiPriority="49"/>
+    <w:lsdException w:name="Grid Table 5 Dark Accent 1" w:uiPriority="50"/>
+    <w:lsdException w:name="Grid Table 6 Colorful Accent 1" w:uiPriority="51"/>
+    <w:lsdException w:name="Grid Table 7 Colorful Accent 1" w:uiPriority="52"/>
+    <w:lsdException w:name="Grid Table 1 Light Accent 2" w:uiPriority="46"/>
+    <w:lsdException w:name="Grid Table 2 Accent 2" w:uiPriority="47"/>
+    <w:lsdException w:name="Grid Table 3 Accent 2" w:uiPriority="48"/>
+    <w:lsdException w:name="Grid Table 4 Accent 2" w:uiPriority="49"/>
+    <w:lsdException w:name="Grid Table 5 Dark Accent 2" w:uiPriority="50"/>
+    <w:lsdException w:name="Grid Table 6 Colorful Accent 2" w:uiPriority="51"/>
+    <w:lsdException w:name="Grid Table 7 Colorful Accent 2" w:uiPriority="52"/>
+    <w:lsdException w:name="Grid Table 1 Light Accent 3" w:uiPriority="46"/>
+    <w:lsdException w:name="Grid Table 2 Accent 3" w:uiPriority="47"/>
+    <w:lsdException w:name="Grid Table 3 Accent 3" w:uiPriority="48"/>
+    <w:lsdException w:name="Grid Table 4 Accent 3" w:uiPriority="49"/>
+    <w:lsdException w:name="Grid Table 5 Dark Accent 3" w:uiPriority="50"/>
+    <w:lsdException w:name="Grid Table 6 Colorful Accent 3" w:uiPriority="51"/>
+    <w:lsdException w:name="Grid Table 7 Colorful Accent 3" w:uiPriority="52"/>
+    <w:lsdException w:name="Grid Table 1 Light Accent 4" w:uiPriority="46"/>
+    <w:lsdException w:name="Grid Table 2 Accent 4" w:uiPriority="47"/>
+    <w:lsdException w:name="Grid Table 3 Accent 4" w:uiPriority="48"/>
+    <w:lsdException w:name="Grid Table 4 Accent 4" w:uiPriority="49"/>
+    <w:lsdException w:name="Grid Table 5 Dark Accent 4" w:uiPriority="50"/>
+    <w:lsdException w:name="Grid Table 6 Colorful Accent 4" w:uiPriority="51"/>
+    <w:lsdException w:name="Grid Table 7 Colorful Accent 4" w:uiPriority="52"/>
+    <w:lsdException w:name="Grid Table 1 Light Accent 5" w:uiPriority="46"/>
+    <w:lsdException w:name="Grid Table 2 Accent 5" w:uiPriority="47"/>
+    <w:lsdException w:name="Grid Table 3 Accent 5" w:uiPriority="48"/>
+    <w:lsdException w:name="Grid Table 4 Accent 5" w:uiPriority="49"/>
+    <w:lsdException w:name="Grid Table 5 Dark Accent 5" w:uiPriority="50"/>
+    <w:lsdException w:name="Grid Table 6 Colorful Accent 5" w:uiPriority="51"/>
+    <w:lsdException w:name="Grid Table 7 Colorful Accent 5" w:uiPriority="52"/>
+    <w:lsdException w:name="Grid Table 1 Light Accent 6" w:uiPriority="46"/>
+    <w:lsdException w:name="Grid Table 2 Accent 6" w:uiPriority="47"/>
+    <w:lsdException w:name="Grid Table 3 Accent 6" w:uiPriority="48"/>
+    <w:lsdException w:name="Grid Table 4 Accent 6" w:uiPriority="49"/>
+    <w:lsdException w:name="Grid Table 5 Dark Accent 6" w:uiPriority="50"/>
+    <w:lsdException w:name="Grid Table 6 Colorful Accent 6" w:uiPriority="51"/>
+    <w:lsdException w:name="Grid Table 7 Colorful Accent 6" w:uiPriority="52"/>
+    <w:lsdException w:name="List Table 1 Light" w:uiPriority="46"/>
+    <w:lsdException w:name="List Table 2" w:uiPriority="47"/>
+    <w:lsdException w:name="List Table 3" w:uiPriority="48"/>
+    <w:lsdException w:name="List Table 4" w:uiPriority="49"/>
+    <w:lsdException w:name="List Table 5 Dark" w:uiPriority="50"/>
+    <w:lsdException w:name="List Table 6 Colorful" w:uiPriority="51"/>
+    <w:lsdException w:name="List Table 7 Colorful" w:uiPriority="52"/>
+    <w:lsdException w:name="List Table 1 Light Accent 1" w:uiPriority="46"/>
+    <w:lsdException w:name="List Table 2 Accent 1" w:uiPriority="47"/>
+    <w:lsdException w:name="List Table 3 Accent 1" w:uiPriority="48"/>
+    <w:lsdException w:name="List Table 4 Accent 1" w:uiPriority="49"/>
+    <w:lsdException w:name="List Table 5 Dark Accent 1" w:uiPriority="50"/>
+    <w:lsdException w:name="List Table 6 Colorful Accent 1" w:uiPriority="51"/>
+    <w:lsdException w:name="List Table 7 Colorful Accent 1" w:uiPriority="52"/>
+    <w:lsdException w:name="List Table 1 Light Accent 2" w:uiPriority="46"/>
+    <w:lsdException w:name="List Table 2 Accent 2" w:uiPriority="47"/>
+    <w:lsdException w:name="List Table 3 Accent 2" w:uiPriority="48"/>
+    <w:lsdException w:name="List Table 4 Accent 2" w:uiPriority="49"/>
+    <w:lsdException w:name="List Table 5 Dark Accent 2" w:uiPriority="50"/>
+    <w:lsdException w:name="List Table 6 Colorful Accent 2" w:uiPriority="51"/>
+    <w:lsdException w:name="List Table 7 Colorful Accent 2" w:uiPriority="52"/>
+    <w:lsdException w:name="List Table 1 Light Accent 3" w:uiPriority="46"/>
+    <w:lsdException w:name="List Table 2 Accent 3" w:uiPriority="47"/>
+    <w:lsdException w:name="List Table 3 Accent 3" w:uiPriority="48"/>
+    <w:lsdException w:name="List Table 4 Accent 3" w:uiPriority="49"/>
+    <w:lsdException w:name="List Table 5 Dark Accent 3" w:uiPriority="50"/>
+    <w:lsdException w:name="List Table 6 Colorful Accent 3" w:uiPriority="51"/>
+    <w:lsdException w:name="List Table 7 Colorful Accent 3" w:uiPriority="52"/>
+    <w:lsdException w:name="List Table 1 Light Accent 4" w:uiPriority="46"/>
+    <w:lsdException w:name="List Table 2 Accent 4" w:uiPriority="47"/>
+    <w:lsdException w:name="List Table 3 Accent 4" w:uiPriority="48"/>
+    <w:lsdException w:name="List Table 4 Accent 4" w:uiPriority="49"/>
+    <w:lsdException w:name="List Table 5 Dark Accent 4" w:uiPriority="50"/>
+    <w:lsdException w:name="List Table 6 Colorful Accent 4" w:uiPriority="51"/>
+    <w:lsdException w:name="List Table 7 Colorful Accent 4" w:uiPriority="52"/>
+    <w:lsdException w:name="List Table 1 Light Accent 5" w:uiPriority="46"/>
+    <w:lsdException w:name="List Table 2 Accent 5" w:uiPriority="47"/>
+    <w:lsdException w:name="List Table 3 Accent 5" w:uiPriority="48"/>
+    <w:lsdException w:name="List Table 4 Accent 5" w:uiPriority="49"/>
+    <w:lsdException w:name="List Table 5 Dark Accent 5" w:uiPriority="50"/>
+    <w:lsdException w:name="List Table 6 Colorful Accent 5" w:uiPriority="51"/>
+    <w:lsdException w:name="List Table 7 Colorful Accent 5" w:uiPriority="52"/>
+    <w:lsdException w:name="List Table 1 Light Accent 6" w:uiPriority="46"/>
+    <w:lsdException w:name="List Table 2 Accent 6" w:uiPriority="47"/>
+    <w:lsdException w:name="List Table 3 Accent 6" w:uiPriority="48"/>
+    <w:lsdException w:name="List Table 4 Accent 6" w:uiPriority="49"/>
+    <w:lsdException w:name="List Table 5 Dark Accent 6" w:uiPriority="50"/>
+    <w:lsdException w:name="List Table 6 Colorful Accent 6" w:uiPriority="51"/>
+    <w:lsdException w:name="List Table 7 Colorful Accent 6" w:uiPriority="52"/>
+    <w:lsdException w:name="Mention" w:semiHidden="1" w:unhideWhenUsed="1"/>
+    <w:lsdException w:name="Smart Hyperlink" w:semiHidden="1" w:unhideWhenUsed="1"/>
+    <w:lsdException w:name="Hashtag" w:semiHidden="1" w:unhideWhenUsed="1"/>
+    <w:lsdException w:name="Unresolved Mention" w:semiHidden="1" w:unhideWhenUsed="1"/>
+    <w:lsdException w:name="Smart Link" w:semiHidden="1" w:unhideWhenUsed="1"/>
+  </w:latentStyles>
+  <w:style w:type="paragraph" w:default="1" w:styleId="Normal">
+    <w:name w:val="Normal"/>
+    <w:qFormat/>
+  </w:style>
+  <w:style w:type="paragraph" w:styleId="Titre1">
+    <w:name w:val="heading 1"/>
+    <w:uiPriority w:val="9"/>
+    <w:qFormat/>
+    <w:pPr>
+      <w:outlineLvl w:val="0"/>
+    </w:pPr>
+    <w:rPr>
+      <w:color w:val="2E74B5"/>
+      <w:sz w:val="32"/>
+      <w:szCs w:val="32"/>
+    </w:rPr>
+  </w:style>
+  <w:style w:type="paragraph" w:styleId="Titre2">
+    <w:name w:val="heading 2"/>
+    <w:uiPriority w:val="9"/>
+    <w:unhideWhenUsed/>
+    <w:qFormat/>
+    <w:pPr>
+      <w:outlineLvl w:val="1"/>
+    </w:pPr>
+    <w:rPr>
+      <w:color w:val="2E74B5"/>
+      <w:sz w:val="26"/>
+      <w:szCs w:val="26"/>
+    </w:rPr>
+  </w:style>
+  <w:style w:type="paragraph" w:styleId="Titre3">
+    <w:name w:val="heading 3"/>
+    <w:uiPriority w:val="9"/>
+    <w:semiHidden/>
+    <w:unhideWhenUsed/>
+    <w:qFormat/>
+    <w:pPr>
+      <w:outlineLvl w:val="2"/>
+    </w:pPr>
+    <w:rPr>
+      <w:color w:val="1F4D78"/>
+      <w:sz w:val="24"/>
+      <w:szCs w:val="24"/>
+    </w:rPr>
+  </w:style>
+  <w:style w:type="paragraph" w:styleId="Titre4">
+    <w:name w:val="heading 4"/>
+    <w:uiPriority w:val="9"/>
+    <w:semiHidden/>
+    <w:unhideWhenUsed/>
+    <w:qFormat/>
+    <w:pPr>
+      <w:outlineLvl w:val="3"/>
+    </w:pPr>
+    <w:rPr>
+      <w:i/>
+      <w:iCs/>
+      <w:color w:val="2E74B5"/>
+    </w:rPr>
+  </w:style>
+  <w:style w:type="paragraph" w:styleId="Titre5">
+    <w:name w:val="heading 5"/>
+    <w:uiPriority w:val="9"/>
+    <w:semiHidden/>
+    <w:unhideWhenUsed/>
+    <w:qFormat/>
+    <w:pPr>
+      <w:outlineLvl w:val="4"/>
+    </w:pPr>
+    <w:rPr>
+      <w:color w:val="2E74B5"/>
+    </w:rPr>
+  </w:style>
+  <w:style w:type="paragraph" w:styleId="Titre6">
+    <w:name w:val="heading 6"/>
+    <w:uiPriority w:val="9"/>
+    <w:semiHidden/>
+    <w:unhideWhenUsed/>
+    <w:qFormat/>
+    <w:pPr>
+      <w:outlineLvl w:val="5"/>
+    </w:pPr>
+    <w:rPr>
+      <w:color w:val="1F4D78"/>
+    </w:rPr>
+  </w:style>
+  <w:style w:type="character" w:default="1" w:styleId="Policepardfaut">
+    <w:name w:val="Default Paragraph Font"/>
+    <w:uiPriority w:val="1"/>
+    <w:semiHidden/>
+    <w:unhideWhenUsed/>
+  </w:style>
+  <w:style w:type="table" w:default="1" w:styleId="TableauNormal">
+    <w:name w:val="Normal Table"/>
+    <w:uiPriority w:val="99"/>
+    <w:semiHidden/>
+    <w:unhideWhenUsed/>
+    <w:tblPr>
+      <w:tblInd w:w="0" w:type="dxa"/>
+      <w:tblCellMar>
+        <w:top w:w="0" w:type="dxa"/>
+        <w:left w:w="108" w:type="dxa"/>
+        <w:bottom w:w="0" w:type="dxa"/>
+        <w:right w:w="108" w:type="dxa"/>
+      </w:tblCellMar>
+    </w:tblPr>
+  </w:style>
+  <w:style w:type="numbering" w:default="1" w:styleId="Aucuneliste">
+    <w:name w:val="No List"/>
+    <w:uiPriority w:val="99"/>
+    <w:semiHidden/>
+    <w:unhideWhenUsed/>
+  </w:style>
+  <w:style w:type="paragraph" w:styleId="Titre">
     <w:name w:val="Title"/>
-    <w:basedOn w:val="Normal"/>
-    <w:next w:val="Normal"/>
+    <w:uiPriority w:val="10"/>
     <w:qFormat/>
     <w:rPr>
       <w:sz w:val="56"/>
       <w:szCs w:val="56"/>
     </w:rPr>
   </w:style>
-  <w:style w:type="paragraph" w:styleId="Heading1">
-    <w:name w:val="Heading 1"/>
-    <w:basedOn w:val="Normal"/>
-    <w:next w:val="Normal"/>
-    <w:qFormat/>
-    <w:rPr>
-      <w:color w:val="2E74B5"/>
-      <w:sz w:val="32"/>
-      <w:szCs w:val="32"/>
-    </w:rPr>
-  </w:style>
-  <w:style w:type="paragraph" w:styleId="Heading2">
-    <w:name w:val="Heading 2"/>
-    <w:basedOn w:val="Normal"/>
-    <w:next w:val="Normal"/>
-    <w:qFormat/>
-    <w:rPr>
-      <w:color w:val="2E74B5"/>
-      <w:sz w:val="26"/>
-      <w:szCs w:val="26"/>
-    </w:rPr>
-  </w:style>
-  <w:style w:type="paragraph" w:styleId="Heading3">
-    <w:name w:val="Heading 3"/>
-    <w:basedOn w:val="Normal"/>
-    <w:next w:val="Normal"/>
-    <w:qFormat/>
-    <w:rPr>
-      <w:color w:val="1F4D78"/>
-      <w:sz w:val="24"/>
-      <w:szCs w:val="24"/>
-    </w:rPr>
-  </w:style>
-  <w:style w:type="paragraph" w:styleId="Heading4">
-    <w:name w:val="Heading 4"/>
-    <w:basedOn w:val="Normal"/>
-    <w:next w:val="Normal"/>
-    <w:qFormat/>
-    <w:rPr>
-      <w:i/>
-      <w:iCs/>
-      <w:color w:val="2E74B5"/>
-    </w:rPr>
-  </w:style>
-  <w:style w:type="paragraph" w:styleId="Heading5">
-    <w:name w:val="Heading 5"/>
-    <w:basedOn w:val="Normal"/>
-    <w:next w:val="Normal"/>
-    <w:qFormat/>
-    <w:rPr>
-      <w:color w:val="2E74B5"/>
-    </w:rPr>
-  </w:style>
-  <w:style w:type="paragraph" w:styleId="Heading6">
-    <w:name w:val="Heading 6"/>
-    <w:basedOn w:val="Normal"/>
-    <w:next w:val="Normal"/>
-    <w:qFormat/>
-    <w:rPr>
-      <w:color w:val="1F4D78"/>
-    </w:rPr>
-  </w:style>
-  <w:style w:type="paragraph" w:styleId="Strong">
-    <w:name w:val="Strong"/>
-    <w:basedOn w:val="Normal"/>
-    <w:next w:val="Normal"/>
+  <w:style w:type="paragraph" w:customStyle="1" w:styleId="lev1">
+    <w:name w:val="Élevé1"/>
     <w:qFormat/>
     <w:rPr>
       <w:b/>
       <w:bCs/>
     </w:rPr>
   </w:style>
-  <w:style w:type="paragraph" w:styleId="ListParagraph">
+  <w:style w:type="paragraph" w:styleId="Paragraphedeliste">
     <w:name w:val="List Paragraph"/>
-    <w:basedOn w:val="Normal"/>
     <w:qFormat/>
   </w:style>
-  <w:style w:type="character" w:styleId="Hyperlink">
+  <w:style w:type="character" w:styleId="Lienhypertexte">
     <w:name w:val="Hyperlink"/>
-    <w:basedOn w:val="DefaultParagraphFont"/>
     <w:uiPriority w:val="99"/>
     <w:unhideWhenUsed/>
     <w:rPr>
@@ -1802,9 +2357,8 @@
       <w:u w:val="single"/>
     </w:rPr>
   </w:style>
-  <w:style w:type="character" w:styleId="FootnoteReference">
+  <w:style w:type="character" w:styleId="Appelnotedebasdep">
     <w:name w:val="footnote reference"/>
-    <w:basedOn w:val="DefaultParagraphFont"/>
     <w:uiPriority w:val="99"/>
     <w:semiHidden/>
     <w:unhideWhenUsed/>
@@ -1812,25 +2366,16 @@
       <w:vertAlign w:val="superscript"/>
     </w:rPr>
   </w:style>
-  <w:style w:type="paragraph" w:styleId="FootnoteText">
+  <w:style w:type="paragraph" w:styleId="Notedebasdepage">
     <w:name w:val="footnote text"/>
-    <w:basedOn w:val="Normal"/>
-    <w:link w:val="FootnoteTextChar"/>
+    <w:link w:val="NotedebasdepageCar"/>
     <w:uiPriority w:val="99"/>
     <w:semiHidden/>
     <w:unhideWhenUsed/>
-    <w:pPr>
-      <w:spacing w:after="0" w:line="240" w:lineRule="auto"/>
-    </w:pPr>
-    <w:rPr>
-      <w:sz w:val="20"/>
-      <w:szCs w:val="20"/>
-    </w:rPr>
   </w:style>
-  <w:style w:type="character" w:styleId="FootnoteTextChar">
-    <w:name w:val="Footnote Text Char"/>
-    <w:basedOn w:val="DefaultParagraphFont"/>
-    <w:link w:val="FootnoteText"/>
+  <w:style w:type="character" w:customStyle="1" w:styleId="NotedebasdepageCar">
+    <w:name w:val="Note de bas de page Car"/>
+    <w:link w:val="Notedebasdepage"/>
     <w:uiPriority w:val="99"/>
     <w:semiHidden/>
     <w:unhideWhenUsed/>
@@ -1839,9 +2384,8 @@
       <w:szCs w:val="20"/>
     </w:rPr>
   </w:style>
-  <w:style w:type="character" w:styleId="EndnoteReference">
+  <w:style w:type="character" w:styleId="Appeldenotedefin">
     <w:name w:val="endnote reference"/>
-    <w:basedOn w:val="DefaultParagraphFont"/>
     <w:uiPriority w:val="99"/>
     <w:semiHidden/>
     <w:unhideWhenUsed/>
@@ -1849,25 +2393,16 @@
       <w:vertAlign w:val="superscript"/>
     </w:rPr>
   </w:style>
-  <w:style w:type="paragraph" w:styleId="EndnoteText">
+  <w:style w:type="paragraph" w:styleId="Notedefin">
     <w:name w:val="endnote text"/>
-    <w:basedOn w:val="Normal"/>
-    <w:link w:val="EndnoteTextChar"/>
+    <w:link w:val="NotedefinCar"/>
     <w:uiPriority w:val="99"/>
     <w:semiHidden/>
     <w:unhideWhenUsed/>
-    <w:pPr>
-      <w:spacing w:after="0" w:line="240" w:lineRule="auto"/>
-    </w:pPr>
-    <w:rPr>
-      <w:sz w:val="20"/>
-      <w:szCs w:val="20"/>
-    </w:rPr>
   </w:style>
-  <w:style w:type="character" w:styleId="EndnoteTextChar">
-    <w:name w:val="Endnote Text Char"/>
-    <w:basedOn w:val="DefaultParagraphFont"/>
-    <w:link w:val="EndnoteText"/>
+  <w:style w:type="character" w:customStyle="1" w:styleId="NotedefinCar">
+    <w:name w:val="Note de fin Car"/>
+    <w:link w:val="Notedefin"/>
     <w:uiPriority w:val="99"/>
     <w:semiHidden/>
     <w:unhideWhenUsed/>
@@ -1877,4 +2412,319 @@
     </w:rPr>
   </w:style>
 </w:styles>
+</file>
+
+<file path=word/theme/theme1.xml><?xml version="1.0" encoding="utf-8"?>
+<a:theme xmlns:a="http://schemas.openxmlformats.org/drawingml/2006/main" name="Thème Office">
+  <a:themeElements>
+    <a:clrScheme name="Office">
+      <a:dk1>
+        <a:sysClr val="windowText" lastClr="000000"/>
+      </a:dk1>
+      <a:lt1>
+        <a:sysClr val="window" lastClr="FFFFFF"/>
+      </a:lt1>
+      <a:dk2>
+        <a:srgbClr val="0E2841"/>
+      </a:dk2>
+      <a:lt2>
+        <a:srgbClr val="E8E8E8"/>
+      </a:lt2>
+      <a:accent1>
+        <a:srgbClr val="156082"/>
+      </a:accent1>
+      <a:accent2>
+        <a:srgbClr val="E97132"/>
+      </a:accent2>
+      <a:accent3>
+        <a:srgbClr val="196B24"/>
+      </a:accent3>
+      <a:accent4>
+        <a:srgbClr val="0F9ED5"/>
+      </a:accent4>
+      <a:accent5>
+        <a:srgbClr val="A02B93"/>
+      </a:accent5>
+      <a:accent6>
+        <a:srgbClr val="4EA72E"/>
+      </a:accent6>
+      <a:hlink>
+        <a:srgbClr val="467886"/>
+      </a:hlink>
+      <a:folHlink>
+        <a:srgbClr val="96607D"/>
+      </a:folHlink>
+    </a:clrScheme>
+    <a:fontScheme name="Office">
+      <a:majorFont>
+        <a:latin typeface="Aptos Display" panose="02110004020202020204"/>
+        <a:ea typeface=""/>
+        <a:cs typeface=""/>
+        <a:font script="Jpan" typeface="游ゴシック Light"/>
+        <a:font script="Hang" typeface="맑은 고딕"/>
+        <a:font script="Hans" typeface="等线 Light"/>
+        <a:font script="Hant" typeface="新細明體"/>
+        <a:font script="Arab" typeface="Times New Roman"/>
+        <a:font script="Hebr" typeface="Times New Roman"/>
+        <a:font script="Thai" typeface="Angsana New"/>
+        <a:font script="Ethi" typeface="Nyala"/>
+        <a:font script="Beng" typeface="Vrinda"/>
+        <a:font script="Gujr" typeface="Shruti"/>
+        <a:font script="Khmr" typeface="MoolBoran"/>
+        <a:font script="Knda" typeface="Tunga"/>
+        <a:font script="Guru" typeface="Raavi"/>
+        <a:font script="Cans" typeface="Euphemia"/>
+        <a:font script="Cher" typeface="Plantagenet Cherokee"/>
+        <a:font script="Yiii" typeface="Microsoft Yi Baiti"/>
+        <a:font script="Tibt" typeface="Microsoft Himalaya"/>
+        <a:font script="Thaa" typeface="MV Boli"/>
+        <a:font script="Deva" typeface="Mangal"/>
+        <a:font script="Telu" typeface="Gautami"/>
+        <a:font script="Taml" typeface="Latha"/>
+        <a:font script="Syrc" typeface="Estrangelo Edessa"/>
+        <a:font script="Orya" typeface="Kalinga"/>
+        <a:font script="Mlym" typeface="Kartika"/>
+        <a:font script="Laoo" typeface="DokChampa"/>
+        <a:font script="Sinh" typeface="Iskoola Pota"/>
+        <a:font script="Mong" typeface="Mongolian Baiti"/>
+        <a:font script="Viet" typeface="Times New Roman"/>
+        <a:font script="Uigh" typeface="Microsoft Uighur"/>
+        <a:font script="Geor" typeface="Sylfaen"/>
+        <a:font script="Armn" typeface="Arial"/>
+        <a:font script="Bugi" typeface="Leelawadee UI"/>
+        <a:font script="Bopo" typeface="Microsoft JhengHei"/>
+        <a:font script="Java" typeface="Javanese Text"/>
+        <a:font script="Lisu" typeface="Segoe UI"/>
+        <a:font script="Mymr" typeface="Myanmar Text"/>
+        <a:font script="Nkoo" typeface="Ebrima"/>
+        <a:font script="Olck" typeface="Nirmala UI"/>
+        <a:font script="Osma" typeface="Ebrima"/>
+        <a:font script="Phag" typeface="Phagspa"/>
+        <a:font script="Syrn" typeface="Estrangelo Edessa"/>
+        <a:font script="Syrj" typeface="Estrangelo Edessa"/>
+        <a:font script="Syre" typeface="Estrangelo Edessa"/>
+        <a:font script="Sora" typeface="Nirmala UI"/>
+        <a:font script="Tale" typeface="Microsoft Tai Le"/>
+        <a:font script="Talu" typeface="Microsoft New Tai Lue"/>
+        <a:font script="Tfng" typeface="Ebrima"/>
+      </a:majorFont>
+      <a:minorFont>
+        <a:latin typeface="Aptos" panose="02110004020202020204"/>
+        <a:ea typeface=""/>
+        <a:cs typeface=""/>
+        <a:font script="Jpan" typeface="游明朝"/>
+        <a:font script="Hang" typeface="맑은 고딕"/>
+        <a:font script="Hans" typeface="等线"/>
+        <a:font script="Hant" typeface="新細明體"/>
+        <a:font script="Arab" typeface="Arial"/>
+        <a:font script="Hebr" typeface="Arial"/>
+        <a:font script="Thai" typeface="Cordia New"/>
+        <a:font script="Ethi" typeface="Nyala"/>
+        <a:font script="Beng" typeface="Vrinda"/>
+        <a:font script="Gujr" typeface="Shruti"/>
+        <a:font script="Khmr" typeface="DaunPenh"/>
+        <a:font script="Knda" typeface="Tunga"/>
+        <a:font script="Guru" typeface="Raavi"/>
+        <a:font script="Cans" typeface="Euphemia"/>
+        <a:font script="Cher" typeface="Plantagenet Cherokee"/>
+        <a:font script="Yiii" typeface="Microsoft Yi Baiti"/>
+        <a:font script="Tibt" typeface="Microsoft Himalaya"/>
+        <a:font script="Thaa" typeface="MV Boli"/>
+        <a:font script="Deva" typeface="Mangal"/>
+        <a:font script="Telu" typeface="Gautami"/>
+        <a:font script="Taml" typeface="Latha"/>
+        <a:font script="Syrc" typeface="Estrangelo Edessa"/>
+        <a:font script="Orya" typeface="Kalinga"/>
+        <a:font script="Mlym" typeface="Kartika"/>
+        <a:font script="Laoo" typeface="DokChampa"/>
+        <a:font script="Sinh" typeface="Iskoola Pota"/>
+        <a:font script="Mong" typeface="Mongolian Baiti"/>
+        <a:font script="Viet" typeface="Arial"/>
+        <a:font script="Uigh" typeface="Microsoft Uighur"/>
+        <a:font script="Geor" typeface="Sylfaen"/>
+        <a:font script="Armn" typeface="Arial"/>
+        <a:font script="Bugi" typeface="Leelawadee UI"/>
+        <a:font script="Bopo" typeface="Microsoft JhengHei"/>
+        <a:font script="Java" typeface="Javanese Text"/>
+        <a:font script="Lisu" typeface="Segoe UI"/>
+        <a:font script="Mymr" typeface="Myanmar Text"/>
+        <a:font script="Nkoo" typeface="Ebrima"/>
+        <a:font script="Olck" typeface="Nirmala UI"/>
+        <a:font script="Osma" typeface="Ebrima"/>
+        <a:font script="Phag" typeface="Phagspa"/>
+        <a:font script="Syrn" typeface="Estrangelo Edessa"/>
+        <a:font script="Syrj" typeface="Estrangelo Edessa"/>
+        <a:font script="Syre" typeface="Estrangelo Edessa"/>
+        <a:font script="Sora" typeface="Nirmala UI"/>
+        <a:font script="Tale" typeface="Microsoft Tai Le"/>
+        <a:font script="Talu" typeface="Microsoft New Tai Lue"/>
+        <a:font script="Tfng" typeface="Ebrima"/>
+      </a:minorFont>
+    </a:fontScheme>
+    <a:fmtScheme name="Office">
+      <a:fillStyleLst>
+        <a:solidFill>
+          <a:schemeClr val="phClr"/>
+        </a:solidFill>
+        <a:gradFill rotWithShape="1">
+          <a:gsLst>
+            <a:gs pos="0">
+              <a:schemeClr val="phClr">
+                <a:lumMod val="110000"/>
+                <a:satMod val="105000"/>
+                <a:tint val="67000"/>
+              </a:schemeClr>
+            </a:gs>
+            <a:gs pos="50000">
+              <a:schemeClr val="phClr">
+                <a:lumMod val="105000"/>
+                <a:satMod val="103000"/>
+                <a:tint val="73000"/>
+              </a:schemeClr>
+            </a:gs>
+            <a:gs pos="100000">
+              <a:schemeClr val="phClr">
+                <a:lumMod val="105000"/>
+                <a:satMod val="109000"/>
+                <a:tint val="81000"/>
+              </a:schemeClr>
+            </a:gs>
+          </a:gsLst>
+          <a:lin ang="5400000" scaled="0"/>
+        </a:gradFill>
+        <a:gradFill rotWithShape="1">
+          <a:gsLst>
+            <a:gs pos="0">
+              <a:schemeClr val="phClr">
+                <a:satMod val="103000"/>
+                <a:lumMod val="102000"/>
+                <a:tint val="94000"/>
+              </a:schemeClr>
+            </a:gs>
+            <a:gs pos="50000">
+              <a:schemeClr val="phClr">
+                <a:satMod val="110000"/>
+                <a:lumMod val="100000"/>
+                <a:shade val="100000"/>
+              </a:schemeClr>
+            </a:gs>
+            <a:gs pos="100000">
+              <a:schemeClr val="phClr">
+                <a:lumMod val="99000"/>
+                <a:satMod val="120000"/>
+                <a:shade val="78000"/>
+              </a:schemeClr>
+            </a:gs>
+          </a:gsLst>
+          <a:lin ang="5400000" scaled="0"/>
+        </a:gradFill>
+      </a:fillStyleLst>
+      <a:lnStyleLst>
+        <a:ln w="12700" cap="flat" cmpd="sng" algn="ctr">
+          <a:solidFill>
+            <a:schemeClr val="phClr"/>
+          </a:solidFill>
+          <a:prstDash val="solid"/>
+          <a:miter lim="800000"/>
+        </a:ln>
+        <a:ln w="19050" cap="flat" cmpd="sng" algn="ctr">
+          <a:solidFill>
+            <a:schemeClr val="phClr"/>
+          </a:solidFill>
+          <a:prstDash val="solid"/>
+          <a:miter lim="800000"/>
+        </a:ln>
+        <a:ln w="25400" cap="flat" cmpd="sng" algn="ctr">
+          <a:solidFill>
+            <a:schemeClr val="phClr"/>
+          </a:solidFill>
+          <a:prstDash val="solid"/>
+          <a:miter lim="800000"/>
+        </a:ln>
+      </a:lnStyleLst>
+      <a:effectStyleLst>
+        <a:effectStyle>
+          <a:effectLst/>
+        </a:effectStyle>
+        <a:effectStyle>
+          <a:effectLst/>
+        </a:effectStyle>
+        <a:effectStyle>
+          <a:effectLst>
+            <a:outerShdw blurRad="57150" dist="19050" dir="5400000" algn="ctr" rotWithShape="0">
+              <a:srgbClr val="000000">
+                <a:alpha val="63000"/>
+              </a:srgbClr>
+            </a:outerShdw>
+          </a:effectLst>
+        </a:effectStyle>
+      </a:effectStyleLst>
+      <a:bgFillStyleLst>
+        <a:solidFill>
+          <a:schemeClr val="phClr"/>
+        </a:solidFill>
+        <a:solidFill>
+          <a:schemeClr val="phClr">
+            <a:tint val="95000"/>
+            <a:satMod val="170000"/>
+          </a:schemeClr>
+        </a:solidFill>
+        <a:gradFill rotWithShape="1">
+          <a:gsLst>
+            <a:gs pos="0">
+              <a:schemeClr val="phClr">
+                <a:tint val="93000"/>
+                <a:satMod val="150000"/>
+                <a:shade val="98000"/>
+                <a:lumMod val="102000"/>
+              </a:schemeClr>
+            </a:gs>
+            <a:gs pos="50000">
+              <a:schemeClr val="phClr">
+                <a:tint val="98000"/>
+                <a:satMod val="130000"/>
+                <a:shade val="90000"/>
+                <a:lumMod val="103000"/>
+              </a:schemeClr>
+            </a:gs>
+            <a:gs pos="100000">
+              <a:schemeClr val="phClr">
+                <a:shade val="63000"/>
+                <a:satMod val="120000"/>
+              </a:schemeClr>
+            </a:gs>
+          </a:gsLst>
+          <a:lin ang="5400000" scaled="0"/>
+        </a:gradFill>
+      </a:bgFillStyleLst>
+    </a:fmtScheme>
+  </a:themeElements>
+  <a:objectDefaults>
+    <a:lnDef>
+      <a:spPr/>
+      <a:bodyPr/>
+      <a:lstStyle/>
+      <a:style>
+        <a:lnRef idx="2">
+          <a:schemeClr val="accent1"/>
+        </a:lnRef>
+        <a:fillRef idx="0">
+          <a:schemeClr val="accent1"/>
+        </a:fillRef>
+        <a:effectRef idx="1">
+          <a:schemeClr val="accent1"/>
+        </a:effectRef>
+        <a:fontRef idx="minor">
+          <a:schemeClr val="tx1"/>
+        </a:fontRef>
+      </a:style>
+    </a:lnDef>
+  </a:objectDefaults>
+  <a:extraClrSchemeLst/>
+  <a:extLst>
+    <a:ext uri="{05A4C25C-085E-4340-85A3-A5531E510DB2}">
+      <thm15:themeFamily xmlns:thm15="http://schemas.microsoft.com/office/thememl/2012/main" name="Office Theme" id="{2E142A2C-CD16-42D6-873A-C26D2A0506FA}" vid="{1BDDFF52-6CD6-40A5-AB3C-68EB2F1E4D0A}"/>
+    </a:ext>
+  </a:extLst>
+</a:theme>
 </file>
</xml_diff>